<commit_message>
Remove Visual award, update deadlines, replace regulations
- Remove Visual award from all pages (tournament rules, upload form, texts)
- Set registration deadline to 10 August 2026
- Set film submission deadline to 15 August 2026
- Show both deadlines separately on tournament page
- Replace regulation files (RU/KZ/EN) with updated versions

Co-Authored-By: Claude Sonnet 4.6 <noreply@anthropic.com>
Claude-Session: https://claude.ai/code/session_01VnjBq48drrsaGutS28C5br
</commit_message>
<xml_diff>
--- a/public/YCT_Regulations_KZ.docx
+++ b/public/YCT_Regulations_KZ.docx
@@ -1,10 +1,10 @@
 
 <file path=word/document.xml><?xml version="1.0" encoding="utf-8"?>
-<w:document xmlns:wpc="http://schemas.microsoft.com/office/word/2010/wordprocessingCanvas" xmlns:cx="http://schemas.microsoft.com/office/drawing/2014/chartex" xmlns:cx1="http://schemas.microsoft.com/office/drawing/2015/9/8/chartex" xmlns:cx2="http://schemas.microsoft.com/office/drawing/2015/10/21/chartex" xmlns:cx3="http://schemas.microsoft.com/office/drawing/2016/5/9/chartex" xmlns:cx4="http://schemas.microsoft.com/office/drawing/2016/5/10/chartex" xmlns:cx5="http://schemas.microsoft.com/office/drawing/2016/5/11/chartex" xmlns:cx6="http://schemas.microsoft.com/office/drawing/2016/5/12/chartex" xmlns:cx7="http://schemas.microsoft.com/office/drawing/2016/5/13/chartex" xmlns:cx8="http://schemas.microsoft.com/office/drawing/2016/5/14/chartex" xmlns:mc="http://schemas.openxmlformats.org/markup-compatibility/2006" xmlns:aink="http://schemas.microsoft.com/office/drawing/2016/ink" xmlns:am3d="http://schemas.microsoft.com/office/drawing/2017/model3d" xmlns:o="urn:schemas-microsoft-com:office:office" xmlns:oel="http://schemas.microsoft.com/office/2019/extlst" xmlns:r="http://schemas.openxmlformats.org/officeDocument/2006/relationships" xmlns:m="http://schemas.openxmlformats.org/officeDocument/2006/math" xmlns:v="urn:schemas-microsoft-com:vml" xmlns:wp14="http://schemas.microsoft.com/office/word/2010/wordprocessingDrawing" xmlns:wp="http://schemas.openxmlformats.org/drawingml/2006/wordprocessingDrawing" xmlns:w10="urn:schemas-microsoft-com:office:word" xmlns:w="http://schemas.openxmlformats.org/wordprocessingml/2006/main" xmlns:w14="http://schemas.microsoft.com/office/word/2010/wordml" xmlns:w15="http://schemas.microsoft.com/office/word/2012/wordml" xmlns:w16cex="http://schemas.microsoft.com/office/word/2018/wordml/cex" xmlns:w16cid="http://schemas.microsoft.com/office/word/2016/wordml/cid" xmlns:w16="http://schemas.microsoft.com/office/word/2018/wordml" xmlns:w16du="http://schemas.microsoft.com/office/word/2023/wordml/word16du" xmlns:w16sdtdh="http://schemas.microsoft.com/office/word/2020/wordml/sdtdatahash" xmlns:w16sdtfl="http://schemas.microsoft.com/office/word/2024/wordml/sdtformatlock" xmlns:w16se="http://schemas.microsoft.com/office/word/2015/wordml/symex" xmlns:wpg="http://schemas.microsoft.com/office/word/2010/wordprocessingGroup" xmlns:wpi="http://schemas.microsoft.com/office/word/2010/wordprocessingInk" xmlns:wne="http://schemas.microsoft.com/office/word/2006/wordml" xmlns:wps="http://schemas.microsoft.com/office/word/2010/wordprocessingShape" mc:Ignorable="w14 w15 w16se w16cid w16 w16cex w16sdtdh w16sdtfl w16du wp14">
+<w:document xmlns:wpc="http://schemas.microsoft.com/office/word/2010/wordprocessingCanvas" xmlns:cx="http://schemas.microsoft.com/office/drawing/2014/chartex" xmlns:cx1="http://schemas.microsoft.com/office/drawing/2015/9/8/chartex" xmlns:cx2="http://schemas.microsoft.com/office/drawing/2015/10/21/chartex" xmlns:cx3="http://schemas.microsoft.com/office/drawing/2016/5/9/chartex" xmlns:cx4="http://schemas.microsoft.com/office/drawing/2016/5/10/chartex" xmlns:cx5="http://schemas.microsoft.com/office/drawing/2016/5/11/chartex" xmlns:cx6="http://schemas.microsoft.com/office/drawing/2016/5/12/chartex" xmlns:cx7="http://schemas.microsoft.com/office/drawing/2016/5/13/chartex" xmlns:cx8="http://schemas.microsoft.com/office/drawing/2016/5/14/chartex" xmlns:mc="http://schemas.openxmlformats.org/markup-compatibility/2006" xmlns:aink="http://schemas.microsoft.com/office/drawing/2016/ink" xmlns:am3d="http://schemas.microsoft.com/office/drawing/2017/model3d" xmlns:o="urn:schemas-microsoft-com:office:office" xmlns:r="http://schemas.openxmlformats.org/officeDocument/2006/relationships" xmlns:m="http://schemas.openxmlformats.org/officeDocument/2006/math" xmlns:v="urn:schemas-microsoft-com:vml" xmlns:wp14="http://schemas.microsoft.com/office/word/2010/wordprocessingDrawing" xmlns:wp="http://schemas.openxmlformats.org/drawingml/2006/wordprocessingDrawing" xmlns:w10="urn:schemas-microsoft-com:office:word" xmlns:w="http://schemas.openxmlformats.org/wordprocessingml/2006/main" xmlns:w14="http://schemas.microsoft.com/office/word/2010/wordml" xmlns:w15="http://schemas.microsoft.com/office/word/2012/wordml" xmlns:w16cex="http://schemas.microsoft.com/office/word/2018/wordml/cex" xmlns:w16cid="http://schemas.microsoft.com/office/word/2016/wordml/cid" xmlns:w16="http://schemas.microsoft.com/office/word/2018/wordml" xmlns:w16sdtdh="http://schemas.microsoft.com/office/word/2020/wordml/sdtdatahash" xmlns:w16se="http://schemas.microsoft.com/office/word/2015/wordml/symex" xmlns:wpg="http://schemas.microsoft.com/office/word/2010/wordprocessingGroup" xmlns:wpi="http://schemas.microsoft.com/office/word/2010/wordprocessingInk" xmlns:wne="http://schemas.microsoft.com/office/word/2006/wordml" xmlns:wps="http://schemas.microsoft.com/office/word/2010/wordprocessingShape" mc:Ignorable="w14 w15 w16se w16cid w16 w16cex w16sdtdh wp14">
   <w:body>
     <w:p>
       <w:pPr>
-        <w:pStyle w:val="Heading1"/>
+        <w:pStyle w:val="1"/>
         <w:keepNext/>
       </w:pPr>
       <w:r>
@@ -22,7 +22,7 @@
     </w:p>
     <w:p>
       <w:pPr>
-        <w:pStyle w:val="Heading2"/>
+        <w:pStyle w:val="2"/>
         <w:keepNext/>
         <w:rPr>
           <w:bCs w:val="0"/>
@@ -106,6 +106,7 @@
     </w:p>
     <w:p>
       <w:r>
+        <w:lastRenderedPageBreak/>
         <w:t>14. Шығармашылық адалдық — жұмысты өз бетінше орындауды, ұсынылатын нәтижелердің дұрыстығын және плагиатқа жол берілмеуін көздейтін Турнир қатысушыларының мінез-құлық қағидаттары мен нормаларының жиынтығы.</w:t>
       </w:r>
     </w:p>
@@ -136,7 +137,7 @@
     </w:p>
     <w:p>
       <w:pPr>
-        <w:pStyle w:val="Heading2"/>
+        <w:pStyle w:val="2"/>
         <w:keepNext/>
         <w:rPr>
           <w:bCs w:val="0"/>
@@ -195,7 +196,7 @@
     </w:p>
     <w:p>
       <w:pPr>
-        <w:pStyle w:val="Heading2"/>
+        <w:pStyle w:val="2"/>
         <w:keepNext/>
         <w:rPr>
           <w:bCs w:val="0"/>
@@ -239,6 +240,7 @@
     </w:p>
     <w:p>
       <w:r>
+        <w:lastRenderedPageBreak/>
         <w:t>5) конкурстық жұмыстарды жасау кезінде авторлық құқықтар мен шығармашылық адалдық қағидаттарын сақтау;</w:t>
       </w:r>
     </w:p>
@@ -259,7 +261,7 @@
     </w:p>
     <w:p>
       <w:pPr>
-        <w:pStyle w:val="Heading2"/>
+        <w:pStyle w:val="2"/>
         <w:keepNext/>
         <w:rPr>
           <w:bCs w:val="0"/>
@@ -338,7 +340,7 @@
     </w:p>
     <w:p>
       <w:pPr>
-        <w:pStyle w:val="Heading2"/>
+        <w:pStyle w:val="2"/>
         <w:keepNext/>
         <w:rPr>
           <w:bCs w:val="0"/>
@@ -377,6 +379,7 @@
     </w:p>
     <w:p>
       <w:r>
+        <w:lastRenderedPageBreak/>
         <w:t>5. Командалар әртүрлі білім беру ұйымдарының білім алушыларынан құрыла алады. Қатысушылардың оқу орны команда қалыптастыруды шектемейді.</w:t>
       </w:r>
     </w:p>
@@ -387,7 +390,7 @@
     </w:p>
     <w:p>
       <w:pPr>
-        <w:pStyle w:val="Heading2"/>
+        <w:pStyle w:val="2"/>
         <w:keepNext/>
         <w:rPr>
           <w:bCs w:val="0"/>
@@ -466,7 +469,7 @@
     </w:p>
     <w:p>
       <w:pPr>
-        <w:pStyle w:val="Heading2"/>
+        <w:pStyle w:val="2"/>
         <w:keepNext/>
         <w:rPr>
           <w:bCs w:val="0"/>
@@ -490,7 +493,19 @@
     </w:p>
     <w:p>
       <w:r>
-        <w:t>2. Командаларды Турнирге тіркеу 9.06.2026 бастап 29.07.2026 дейін қоса алғанда жүргізіледі.</w:t>
+        <w:t xml:space="preserve">2. Командаларды Турнирге тіркеу 9.06.2026 бастап </w:t>
+      </w:r>
+      <w:r>
+        <w:t>10</w:t>
+      </w:r>
+      <w:r>
+        <w:t>.0</w:t>
+      </w:r>
+      <w:r>
+        <w:t>8</w:t>
+      </w:r>
+      <w:r>
+        <w:t>.2026 дейін қоса алғанда жүргізіледі.</w:t>
       </w:r>
     </w:p>
     <w:p>
@@ -500,7 +515,59 @@
     </w:p>
     <w:p>
       <w:r>
-        <w:t>4. Команданың өтінімі 30.07.2026 күнінен кешіктірмей, қоса алғанда, толтырылып, жіберілуі тиіс.</w:t>
+        <w:t xml:space="preserve">4. </w:t>
+      </w:r>
+      <w:proofErr w:type="spellStart"/>
+      <w:r>
+        <w:t>Команданың</w:t>
+      </w:r>
+      <w:proofErr w:type="spellEnd"/>
+      <w:r>
+        <w:t xml:space="preserve"> </w:t>
+      </w:r>
+      <w:proofErr w:type="spellStart"/>
+      <w:r>
+        <w:t>өтінімі</w:t>
+      </w:r>
+      <w:proofErr w:type="spellEnd"/>
+      <w:r>
+        <w:t xml:space="preserve"> </w:t>
+      </w:r>
+      <w:r>
+        <w:t>15</w:t>
+      </w:r>
+      <w:r>
+        <w:t>.0</w:t>
+      </w:r>
+      <w:r>
+        <w:t>8</w:t>
+      </w:r>
+      <w:r>
+        <w:t xml:space="preserve">.2026 </w:t>
+      </w:r>
+      <w:proofErr w:type="spellStart"/>
+      <w:r>
+        <w:t>күнінен</w:t>
+      </w:r>
+      <w:proofErr w:type="spellEnd"/>
+      <w:r>
+        <w:t xml:space="preserve"> </w:t>
+      </w:r>
+      <w:proofErr w:type="spellStart"/>
+      <w:r>
+        <w:t>кешіктірмей</w:t>
+      </w:r>
+      <w:proofErr w:type="spellEnd"/>
+      <w:r>
+        <w:t xml:space="preserve">, </w:t>
+      </w:r>
+      <w:proofErr w:type="spellStart"/>
+      <w:r>
+        <w:t>қоса</w:t>
+      </w:r>
+      <w:proofErr w:type="spellEnd"/>
+      <w:r>
+        <w:t xml:space="preserve"> алғанда, толтырылып, жіберілуі тиіс.</w:t>
       </w:r>
     </w:p>
     <w:p>
@@ -510,7 +577,7 @@
     </w:p>
     <w:p>
       <w:pPr>
-        <w:pStyle w:val="Heading2"/>
+        <w:pStyle w:val="2"/>
         <w:keepNext/>
         <w:rPr>
           <w:bCs w:val="0"/>
@@ -556,11 +623,10 @@
       <w:r>
         <w:t>4) ағылшын тіліндегі субтитрлердің болуы міндетті;</w:t>
       </w:r>
-      <w:r/>
-      <w:r/>
-    </w:p>
-    <w:p>
-      <w:r>
+    </w:p>
+    <w:p>
+      <w:r>
+        <w:lastRenderedPageBreak/>
         <w:t>5) фильмде бөгде брендтер мен жасырын жарнаманың болуына тыйым салынады;</w:t>
       </w:r>
     </w:p>
@@ -571,7 +637,47 @@
     </w:p>
     <w:p>
       <w:r>
-        <w:t>7) команда үміттенетін кино марапаттарының Impact award, Visual award, Tech award ішіндегі реті. (Мысалы: 1) Tech award. 2) Impact award. 3) Visual award).</w:t>
+        <w:t xml:space="preserve">7) команда үміттенетін кино </w:t>
+      </w:r>
+      <w:proofErr w:type="spellStart"/>
+      <w:r>
+        <w:t>марапаттарының</w:t>
+      </w:r>
+      <w:proofErr w:type="spellEnd"/>
+      <w:r>
+        <w:t xml:space="preserve"> Impact </w:t>
+      </w:r>
+      <w:proofErr w:type="spellStart"/>
+      <w:r>
+        <w:t>award</w:t>
+      </w:r>
+      <w:proofErr w:type="spellEnd"/>
+      <w:r>
+        <w:t xml:space="preserve">, Tech </w:t>
+      </w:r>
+      <w:proofErr w:type="spellStart"/>
+      <w:r>
+        <w:t>award</w:t>
+      </w:r>
+      <w:proofErr w:type="spellEnd"/>
+      <w:r>
+        <w:t xml:space="preserve"> </w:t>
+      </w:r>
+      <w:proofErr w:type="spellStart"/>
+      <w:r>
+        <w:t>ішіндегі</w:t>
+      </w:r>
+      <w:proofErr w:type="spellEnd"/>
+      <w:r>
+        <w:t xml:space="preserve"> реті. (Мысалы: 1) Tech award. 2) Impact </w:t>
+      </w:r>
+      <w:proofErr w:type="spellStart"/>
+      <w:r>
+        <w:t>award</w:t>
+      </w:r>
+      <w:proofErr w:type="spellEnd"/>
+      <w:r>
+        <w:t>.).</w:t>
       </w:r>
     </w:p>
     <w:p>
@@ -593,12 +699,6 @@
       <w:r>
         <w:t>6. Команданың Connect және Reach аясында не істегенінің қысқаша сипаттамасы, әр марапат үшін 50-ден 150 сөзге дейін, әлеуметтік желіні көрсетуді қоса алғанда.</w:t>
       </w:r>
-      <w:r/>
-      <w:r/>
-      <w:r/>
-      <w:r/>
-      <w:r/>
-      <w:r/>
     </w:p>
     <w:p>
       <w:r>
@@ -619,8 +719,6 @@
       <w:r>
         <w:t>10. Осы адамдардың және команда қатысушыларының Т.А.Ә.-і, сондай-ақ олардың рөлдері латын әліпбиімен толтырылуы тиіс.</w:t>
       </w:r>
-      <w:r/>
-      <w:r/>
     </w:p>
     <w:p>
       <w:pPr>
@@ -629,7 +727,7 @@
     </w:p>
     <w:p>
       <w:pPr>
-        <w:pStyle w:val="Heading2"/>
+        <w:pStyle w:val="2"/>
         <w:keepNext/>
         <w:rPr>
           <w:bCs w:val="0"/>
@@ -688,7 +786,7 @@
     </w:p>
     <w:p>
       <w:pPr>
-        <w:pStyle w:val="Heading2"/>
+        <w:pStyle w:val="2"/>
         <w:keepNext/>
         <w:rPr>
           <w:bCs w:val="0"/>
@@ -702,6 +800,7 @@
           <w:sz w:val="36"/>
           <w:szCs w:val="36"/>
         </w:rPr>
+        <w:lastRenderedPageBreak/>
         <w:t>10-бап. Турнир кезеңдері</w:t>
       </w:r>
     </w:p>
@@ -739,15 +838,11 @@
       <w:r>
         <w:t>1) Тексеру кезеңінен өткен фильмдер фильмдер саны тең немесе біреуден артық айырмашылығы жоқ бірнеше топтамаға (Дивизиондарға) бөлінеді.</w:t>
       </w:r>
-      <w:r/>
-      <w:r/>
     </w:p>
     <w:p>
       <w:r>
         <w:t>2) Әр Дивизион кемінде жиырма адамнан тұратын тәуелсіз топқа (көрермендерге) ұсынылады.</w:t>
       </w:r>
-      <w:r/>
-      <w:r/>
     </w:p>
     <w:p>
       <w:r>
@@ -758,9 +853,6 @@
       <w:r>
         <w:t>4) Көрермендердің әрқайсысы көрілген Бағдарламадан әр кино марапатына екі үміткерден таңдайды, бұл ретте бір кино бағытының бірінші және екінші үміткерлері әртүрлі болуы тиіс, сондай-ақ барлық бірінші және барлық екінші үміткерлер өзара ерекшеленуі тиіс.</w:t>
       </w:r>
-      <w:r/>
-      <w:r/>
-      <w:r/>
     </w:p>
     <w:p>
       <w:r>
@@ -791,7 +883,6 @@
       <w:r>
         <w:t>2) Бағытқа байланысты тиісті марапатта сипатталған Фильм қасиеттеріне басымдық беріледі.</w:t>
       </w:r>
-      <w:r/>
     </w:p>
     <w:p>
       <w:r>
@@ -810,7 +901,7 @@
     </w:p>
     <w:p>
       <w:pPr>
-        <w:pStyle w:val="Heading2"/>
+        <w:pStyle w:val="2"/>
         <w:keepNext/>
         <w:rPr>
           <w:bCs w:val="0"/>
@@ -834,6 +925,7 @@
     </w:p>
     <w:p>
       <w:r>
+        <w:lastRenderedPageBreak/>
         <w:t>2. «Inspire» бағалауы екі компонентті қамтиды:</w:t>
       </w:r>
     </w:p>
@@ -939,6 +1031,7 @@
     </w:p>
     <w:p>
       <w:r>
+        <w:lastRenderedPageBreak/>
         <w:t>10. Команда жюридің талабы бойынша статистикаға қолжетімділік беруге міндетті. Аномалды белсенділік анықталған жағдайда баға төмендетілуі мүмкін. Жасанды ілгерілету әдістерін қолдануға жол берілмейді. Бұзушылық болған жағдайда осы критерий бойынша баға нөлге дейін төмендетілуі мүмкін.</w:t>
       </w:r>
     </w:p>
@@ -949,7 +1042,7 @@
     </w:p>
     <w:p>
       <w:pPr>
-        <w:pStyle w:val="Heading2"/>
+        <w:pStyle w:val="2"/>
         <w:keepNext/>
         <w:rPr>
           <w:bCs w:val="0"/>
@@ -972,53 +1065,783 @@
       </w:r>
     </w:p>
     <w:p>
-      <w:r>
+      <w:pPr>
+        <w:rPr>
+          <w:lang w:val="en-US"/>
+        </w:rPr>
+      </w:pPr>
+      <w:r>
+        <w:rPr>
+          <w:lang w:val="en-US"/>
+        </w:rPr>
         <w:t>1) Impact award;</w:t>
       </w:r>
     </w:p>
     <w:p>
-      <w:r>
-        <w:t>2) Visual award;</w:t>
-      </w:r>
-    </w:p>
-    <w:p>
-      <w:r>
-        <w:t>3) Tech award;</w:t>
-      </w:r>
-    </w:p>
-    <w:p>
-      <w:r>
-        <w:t>4) Glorious award.</w:t>
-      </w:r>
-    </w:p>
-    <w:p>
-      <w:r>
-        <w:t>2. Impact award көрермендер мен жюриге ең күшті эмоциялық және мағыналық әсер қалдырған жұмысқа беріледі.</w:t>
-      </w:r>
-    </w:p>
-    <w:p>
-      <w:r>
-        <w:t>3. Visual award ең мәнерлі, тұтас және эстетикалық тұрғыдан күшті визуалды шешімі бар жұмысқа беріледі. Операторлық жұмыс, кадр композициясы, жарық, түс, стиль, локациялар және фильмнің визуалды құрамдасына қатысты өзге де нәрселер ескеріледі.</w:t>
-      </w:r>
-    </w:p>
-    <w:p>
-      <w:r>
-        <w:t>4. Tech award техникалық орындалудың, күрделіліктің және іске асырудағы тапқырлықтың ең жоғары деңгейін көрсететін жұмысқа беріледі.</w:t>
-      </w:r>
-    </w:p>
-    <w:p>
-      <w:r>
-        <w:t>5. Glorious award Турнирдің бас жүлдесі болып табылады және көрермендер мен жюри ең үздік жұмыс деп бағалаған жұмысқа беріледі.</w:t>
-      </w:r>
-    </w:p>
-    <w:p>
-      <w:r>
-        <w:t>6. Финалда баллдарды есептеу және рейтинг жасау мынадай түрде жүзеге асырылады:</w:t>
-      </w:r>
-    </w:p>
-    <w:p>
-      <w:r>
-        <w:t>1) Жюри жұмыстарды Жюри бағалау бланкіне сәйкес бағалайды, 1-қосымшаны қараңыз.</w:t>
+      <w:pPr>
+        <w:rPr>
+          <w:lang w:val="en-US"/>
+        </w:rPr>
+      </w:pPr>
+      <w:r>
+        <w:rPr>
+          <w:lang w:val="en-US"/>
+        </w:rPr>
+        <w:t>2</w:t>
+      </w:r>
+      <w:r>
+        <w:rPr>
+          <w:lang w:val="en-US"/>
+        </w:rPr>
+        <w:t>) Tech award;</w:t>
+      </w:r>
+    </w:p>
+    <w:p>
+      <w:pPr>
+        <w:rPr>
+          <w:lang w:val="en-US"/>
+        </w:rPr>
+      </w:pPr>
+      <w:r>
+        <w:rPr>
+          <w:lang w:val="en-US"/>
+        </w:rPr>
+        <w:t>3</w:t>
+      </w:r>
+      <w:r>
+        <w:rPr>
+          <w:lang w:val="en-US"/>
+        </w:rPr>
+        <w:t>) Glorious award.</w:t>
+      </w:r>
+    </w:p>
+    <w:p>
+      <w:pPr>
+        <w:rPr>
+          <w:lang w:val="en-US"/>
+        </w:rPr>
+      </w:pPr>
+      <w:r>
+        <w:rPr>
+          <w:lang w:val="en-US"/>
+        </w:rPr>
+        <w:t xml:space="preserve">2. Impact award </w:t>
+      </w:r>
+      <w:proofErr w:type="spellStart"/>
+      <w:r>
+        <w:t>көрермендер</w:t>
+      </w:r>
+      <w:proofErr w:type="spellEnd"/>
+      <w:r>
+        <w:rPr>
+          <w:lang w:val="en-US"/>
+        </w:rPr>
+        <w:t xml:space="preserve"> </w:t>
+      </w:r>
+      <w:r>
+        <w:t>мен</w:t>
+      </w:r>
+      <w:r>
+        <w:rPr>
+          <w:lang w:val="en-US"/>
+        </w:rPr>
+        <w:t xml:space="preserve"> </w:t>
+      </w:r>
+      <w:proofErr w:type="spellStart"/>
+      <w:r>
+        <w:t>жюриге</w:t>
+      </w:r>
+      <w:proofErr w:type="spellEnd"/>
+      <w:r>
+        <w:rPr>
+          <w:lang w:val="en-US"/>
+        </w:rPr>
+        <w:t xml:space="preserve"> </w:t>
+      </w:r>
+      <w:proofErr w:type="spellStart"/>
+      <w:r>
+        <w:t>ең</w:t>
+      </w:r>
+      <w:proofErr w:type="spellEnd"/>
+      <w:r>
+        <w:rPr>
+          <w:lang w:val="en-US"/>
+        </w:rPr>
+        <w:t xml:space="preserve"> </w:t>
+      </w:r>
+      <w:proofErr w:type="spellStart"/>
+      <w:r>
+        <w:t>күшті</w:t>
+      </w:r>
+      <w:proofErr w:type="spellEnd"/>
+      <w:r>
+        <w:rPr>
+          <w:lang w:val="en-US"/>
+        </w:rPr>
+        <w:t xml:space="preserve"> </w:t>
+      </w:r>
+      <w:proofErr w:type="spellStart"/>
+      <w:r>
+        <w:t>эмоциялық</w:t>
+      </w:r>
+      <w:proofErr w:type="spellEnd"/>
+      <w:r>
+        <w:rPr>
+          <w:lang w:val="en-US"/>
+        </w:rPr>
+        <w:t xml:space="preserve"> </w:t>
+      </w:r>
+      <w:proofErr w:type="spellStart"/>
+      <w:r>
+        <w:t>және</w:t>
+      </w:r>
+      <w:proofErr w:type="spellEnd"/>
+      <w:r>
+        <w:rPr>
+          <w:lang w:val="en-US"/>
+        </w:rPr>
+        <w:t xml:space="preserve"> </w:t>
+      </w:r>
+      <w:proofErr w:type="spellStart"/>
+      <w:r>
+        <w:t>мағыналық</w:t>
+      </w:r>
+      <w:proofErr w:type="spellEnd"/>
+      <w:r>
+        <w:rPr>
+          <w:lang w:val="en-US"/>
+        </w:rPr>
+        <w:t xml:space="preserve"> </w:t>
+      </w:r>
+      <w:proofErr w:type="spellStart"/>
+      <w:r>
+        <w:t>әсер</w:t>
+      </w:r>
+      <w:proofErr w:type="spellEnd"/>
+      <w:r>
+        <w:rPr>
+          <w:lang w:val="en-US"/>
+        </w:rPr>
+        <w:t xml:space="preserve"> </w:t>
+      </w:r>
+      <w:proofErr w:type="spellStart"/>
+      <w:r>
+        <w:t>қалдырған</w:t>
+      </w:r>
+      <w:proofErr w:type="spellEnd"/>
+      <w:r>
+        <w:rPr>
+          <w:lang w:val="en-US"/>
+        </w:rPr>
+        <w:t xml:space="preserve"> </w:t>
+      </w:r>
+      <w:proofErr w:type="spellStart"/>
+      <w:r>
+        <w:t>жұмысқа</w:t>
+      </w:r>
+      <w:proofErr w:type="spellEnd"/>
+      <w:r>
+        <w:rPr>
+          <w:lang w:val="en-US"/>
+        </w:rPr>
+        <w:t xml:space="preserve"> </w:t>
+      </w:r>
+      <w:proofErr w:type="spellStart"/>
+      <w:r>
+        <w:t>беріледі</w:t>
+      </w:r>
+      <w:proofErr w:type="spellEnd"/>
+      <w:r>
+        <w:rPr>
+          <w:lang w:val="en-US"/>
+        </w:rPr>
+        <w:t>.</w:t>
+      </w:r>
+    </w:p>
+    <w:p>
+      <w:pPr>
+        <w:rPr>
+          <w:lang w:val="en-US"/>
+        </w:rPr>
+      </w:pPr>
+      <w:r>
+        <w:rPr>
+          <w:lang w:val="en-US"/>
+        </w:rPr>
+        <w:t>3</w:t>
+      </w:r>
+      <w:r>
+        <w:rPr>
+          <w:lang w:val="en-US"/>
+        </w:rPr>
+        <w:t xml:space="preserve">. Tech award </w:t>
+      </w:r>
+      <w:proofErr w:type="spellStart"/>
+      <w:r>
+        <w:t>техникалық</w:t>
+      </w:r>
+      <w:proofErr w:type="spellEnd"/>
+      <w:r>
+        <w:rPr>
+          <w:lang w:val="en-US"/>
+        </w:rPr>
+        <w:t xml:space="preserve"> </w:t>
+      </w:r>
+      <w:proofErr w:type="spellStart"/>
+      <w:r>
+        <w:t>орындалудың</w:t>
+      </w:r>
+      <w:proofErr w:type="spellEnd"/>
+      <w:r>
+        <w:rPr>
+          <w:lang w:val="en-US"/>
+        </w:rPr>
+        <w:t xml:space="preserve">, </w:t>
+      </w:r>
+      <w:proofErr w:type="spellStart"/>
+      <w:r>
+        <w:t>күрделіліктің</w:t>
+      </w:r>
+      <w:proofErr w:type="spellEnd"/>
+      <w:r>
+        <w:rPr>
+          <w:lang w:val="en-US"/>
+        </w:rPr>
+        <w:t xml:space="preserve"> </w:t>
+      </w:r>
+      <w:proofErr w:type="spellStart"/>
+      <w:r>
+        <w:t>және</w:t>
+      </w:r>
+      <w:proofErr w:type="spellEnd"/>
+      <w:r>
+        <w:rPr>
+          <w:lang w:val="en-US"/>
+        </w:rPr>
+        <w:t xml:space="preserve"> </w:t>
+      </w:r>
+      <w:proofErr w:type="spellStart"/>
+      <w:r>
+        <w:t>іске</w:t>
+      </w:r>
+      <w:proofErr w:type="spellEnd"/>
+      <w:r>
+        <w:rPr>
+          <w:lang w:val="en-US"/>
+        </w:rPr>
+        <w:t xml:space="preserve"> </w:t>
+      </w:r>
+      <w:proofErr w:type="spellStart"/>
+      <w:r>
+        <w:t>асырудағы</w:t>
+      </w:r>
+      <w:proofErr w:type="spellEnd"/>
+      <w:r>
+        <w:rPr>
+          <w:lang w:val="en-US"/>
+        </w:rPr>
+        <w:t xml:space="preserve"> </w:t>
+      </w:r>
+      <w:proofErr w:type="spellStart"/>
+      <w:r>
+        <w:t>тапқырлықтың</w:t>
+      </w:r>
+      <w:proofErr w:type="spellEnd"/>
+      <w:r>
+        <w:rPr>
+          <w:lang w:val="en-US"/>
+        </w:rPr>
+        <w:t xml:space="preserve"> </w:t>
+      </w:r>
+      <w:proofErr w:type="spellStart"/>
+      <w:r>
+        <w:t>ең</w:t>
+      </w:r>
+      <w:proofErr w:type="spellEnd"/>
+      <w:r>
+        <w:rPr>
+          <w:lang w:val="en-US"/>
+        </w:rPr>
+        <w:t xml:space="preserve"> </w:t>
+      </w:r>
+      <w:proofErr w:type="spellStart"/>
+      <w:r>
+        <w:t>жоғары</w:t>
+      </w:r>
+      <w:proofErr w:type="spellEnd"/>
+      <w:r>
+        <w:rPr>
+          <w:lang w:val="en-US"/>
+        </w:rPr>
+        <w:t xml:space="preserve"> </w:t>
+      </w:r>
+      <w:proofErr w:type="spellStart"/>
+      <w:r>
+        <w:t>деңгейін</w:t>
+      </w:r>
+      <w:proofErr w:type="spellEnd"/>
+      <w:r>
+        <w:rPr>
+          <w:lang w:val="en-US"/>
+        </w:rPr>
+        <w:t xml:space="preserve"> </w:t>
+      </w:r>
+      <w:proofErr w:type="spellStart"/>
+      <w:r>
+        <w:t>көрсететін</w:t>
+      </w:r>
+      <w:proofErr w:type="spellEnd"/>
+      <w:r>
+        <w:rPr>
+          <w:lang w:val="en-US"/>
+        </w:rPr>
+        <w:t xml:space="preserve"> </w:t>
+      </w:r>
+      <w:proofErr w:type="spellStart"/>
+      <w:r>
+        <w:t>жұмысқа</w:t>
+      </w:r>
+      <w:proofErr w:type="spellEnd"/>
+      <w:r>
+        <w:rPr>
+          <w:lang w:val="en-US"/>
+        </w:rPr>
+        <w:t xml:space="preserve"> </w:t>
+      </w:r>
+      <w:proofErr w:type="spellStart"/>
+      <w:r>
+        <w:t>беріледі</w:t>
+      </w:r>
+      <w:proofErr w:type="spellEnd"/>
+      <w:r>
+        <w:rPr>
+          <w:lang w:val="en-US"/>
+        </w:rPr>
+        <w:t>.</w:t>
+      </w:r>
+    </w:p>
+    <w:p>
+      <w:pPr>
+        <w:rPr>
+          <w:lang w:val="en-US"/>
+        </w:rPr>
+      </w:pPr>
+      <w:r>
+        <w:rPr>
+          <w:lang w:val="en-US"/>
+        </w:rPr>
+        <w:t>4</w:t>
+      </w:r>
+      <w:r>
+        <w:rPr>
+          <w:lang w:val="en-US"/>
+        </w:rPr>
+        <w:t xml:space="preserve">. Glorious award </w:t>
+      </w:r>
+      <w:proofErr w:type="spellStart"/>
+      <w:r>
+        <w:t>Турнирдің</w:t>
+      </w:r>
+      <w:proofErr w:type="spellEnd"/>
+      <w:r>
+        <w:rPr>
+          <w:lang w:val="en-US"/>
+        </w:rPr>
+        <w:t xml:space="preserve"> </w:t>
+      </w:r>
+      <w:r>
+        <w:t>бас</w:t>
+      </w:r>
+      <w:r>
+        <w:rPr>
+          <w:lang w:val="en-US"/>
+        </w:rPr>
+        <w:t xml:space="preserve"> </w:t>
+      </w:r>
+      <w:proofErr w:type="spellStart"/>
+      <w:r>
+        <w:t>жүлдесі</w:t>
+      </w:r>
+      <w:proofErr w:type="spellEnd"/>
+      <w:r>
+        <w:rPr>
+          <w:lang w:val="en-US"/>
+        </w:rPr>
+        <w:t xml:space="preserve"> </w:t>
+      </w:r>
+      <w:proofErr w:type="spellStart"/>
+      <w:r>
+        <w:t>болып</w:t>
+      </w:r>
+      <w:proofErr w:type="spellEnd"/>
+      <w:r>
+        <w:rPr>
+          <w:lang w:val="en-US"/>
+        </w:rPr>
+        <w:t xml:space="preserve"> </w:t>
+      </w:r>
+      <w:proofErr w:type="spellStart"/>
+      <w:r>
+        <w:t>табылады</w:t>
+      </w:r>
+      <w:proofErr w:type="spellEnd"/>
+      <w:r>
+        <w:rPr>
+          <w:lang w:val="en-US"/>
+        </w:rPr>
+        <w:t xml:space="preserve"> </w:t>
+      </w:r>
+      <w:proofErr w:type="spellStart"/>
+      <w:r>
+        <w:t>және</w:t>
+      </w:r>
+      <w:proofErr w:type="spellEnd"/>
+      <w:r>
+        <w:rPr>
+          <w:lang w:val="en-US"/>
+        </w:rPr>
+        <w:t xml:space="preserve"> </w:t>
+      </w:r>
+      <w:proofErr w:type="spellStart"/>
+      <w:r>
+        <w:t>көрермендер</w:t>
+      </w:r>
+      <w:proofErr w:type="spellEnd"/>
+      <w:r>
+        <w:rPr>
+          <w:lang w:val="en-US"/>
+        </w:rPr>
+        <w:t xml:space="preserve"> </w:t>
+      </w:r>
+      <w:r>
+        <w:t>мен</w:t>
+      </w:r>
+      <w:r>
+        <w:rPr>
+          <w:lang w:val="en-US"/>
+        </w:rPr>
+        <w:t xml:space="preserve"> </w:t>
+      </w:r>
+      <w:r>
+        <w:t>жюри</w:t>
+      </w:r>
+      <w:r>
+        <w:rPr>
+          <w:lang w:val="en-US"/>
+        </w:rPr>
+        <w:t xml:space="preserve"> </w:t>
+      </w:r>
+      <w:proofErr w:type="spellStart"/>
+      <w:r>
+        <w:t>ең</w:t>
+      </w:r>
+      <w:proofErr w:type="spellEnd"/>
+      <w:r>
+        <w:rPr>
+          <w:lang w:val="en-US"/>
+        </w:rPr>
+        <w:t xml:space="preserve"> </w:t>
+      </w:r>
+      <w:proofErr w:type="spellStart"/>
+      <w:r>
+        <w:t>үздік</w:t>
+      </w:r>
+      <w:proofErr w:type="spellEnd"/>
+      <w:r>
+        <w:rPr>
+          <w:lang w:val="en-US"/>
+        </w:rPr>
+        <w:t xml:space="preserve"> </w:t>
+      </w:r>
+      <w:proofErr w:type="spellStart"/>
+      <w:r>
+        <w:t>жұмыс</w:t>
+      </w:r>
+      <w:proofErr w:type="spellEnd"/>
+      <w:r>
+        <w:rPr>
+          <w:lang w:val="en-US"/>
+        </w:rPr>
+        <w:t xml:space="preserve"> </w:t>
+      </w:r>
+      <w:proofErr w:type="spellStart"/>
+      <w:r>
+        <w:t>деп</w:t>
+      </w:r>
+      <w:proofErr w:type="spellEnd"/>
+      <w:r>
+        <w:rPr>
+          <w:lang w:val="en-US"/>
+        </w:rPr>
+        <w:t xml:space="preserve"> </w:t>
+      </w:r>
+      <w:proofErr w:type="spellStart"/>
+      <w:r>
+        <w:t>бағалаған</w:t>
+      </w:r>
+      <w:proofErr w:type="spellEnd"/>
+      <w:r>
+        <w:rPr>
+          <w:lang w:val="en-US"/>
+        </w:rPr>
+        <w:t xml:space="preserve"> </w:t>
+      </w:r>
+      <w:proofErr w:type="spellStart"/>
+      <w:r>
+        <w:t>жұмысқа</w:t>
+      </w:r>
+      <w:proofErr w:type="spellEnd"/>
+      <w:r>
+        <w:rPr>
+          <w:lang w:val="en-US"/>
+        </w:rPr>
+        <w:t xml:space="preserve"> </w:t>
+      </w:r>
+      <w:proofErr w:type="spellStart"/>
+      <w:r>
+        <w:t>беріледі</w:t>
+      </w:r>
+      <w:proofErr w:type="spellEnd"/>
+      <w:r>
+        <w:rPr>
+          <w:lang w:val="en-US"/>
+        </w:rPr>
+        <w:t>.</w:t>
+      </w:r>
+    </w:p>
+    <w:p>
+      <w:pPr>
+        <w:rPr>
+          <w:lang w:val="en-US"/>
+        </w:rPr>
+      </w:pPr>
+      <w:r>
+        <w:rPr>
+          <w:lang w:val="en-US"/>
+        </w:rPr>
+        <w:t>5</w:t>
+      </w:r>
+      <w:r>
+        <w:rPr>
+          <w:lang w:val="en-US"/>
+        </w:rPr>
+        <w:t xml:space="preserve">. </w:t>
+      </w:r>
+      <w:proofErr w:type="spellStart"/>
+      <w:r>
+        <w:t>Финалда</w:t>
+      </w:r>
+      <w:proofErr w:type="spellEnd"/>
+      <w:r>
+        <w:rPr>
+          <w:lang w:val="en-US"/>
+        </w:rPr>
+        <w:t xml:space="preserve"> </w:t>
+      </w:r>
+      <w:proofErr w:type="spellStart"/>
+      <w:r>
+        <w:t>баллдарды</w:t>
+      </w:r>
+      <w:proofErr w:type="spellEnd"/>
+      <w:r>
+        <w:rPr>
+          <w:lang w:val="en-US"/>
+        </w:rPr>
+        <w:t xml:space="preserve"> </w:t>
+      </w:r>
+      <w:proofErr w:type="spellStart"/>
+      <w:r>
+        <w:t>есептеу</w:t>
+      </w:r>
+      <w:proofErr w:type="spellEnd"/>
+      <w:r>
+        <w:rPr>
+          <w:lang w:val="en-US"/>
+        </w:rPr>
+        <w:t xml:space="preserve"> </w:t>
+      </w:r>
+      <w:proofErr w:type="spellStart"/>
+      <w:r>
+        <w:t>және</w:t>
+      </w:r>
+      <w:proofErr w:type="spellEnd"/>
+      <w:r>
+        <w:rPr>
+          <w:lang w:val="en-US"/>
+        </w:rPr>
+        <w:t xml:space="preserve"> </w:t>
+      </w:r>
+      <w:r>
+        <w:t>рейтинг</w:t>
+      </w:r>
+      <w:r>
+        <w:rPr>
+          <w:lang w:val="en-US"/>
+        </w:rPr>
+        <w:t xml:space="preserve"> </w:t>
+      </w:r>
+      <w:proofErr w:type="spellStart"/>
+      <w:r>
+        <w:t>жасау</w:t>
+      </w:r>
+      <w:proofErr w:type="spellEnd"/>
+      <w:r>
+        <w:rPr>
+          <w:lang w:val="en-US"/>
+        </w:rPr>
+        <w:t xml:space="preserve"> </w:t>
+      </w:r>
+      <w:proofErr w:type="spellStart"/>
+      <w:r>
+        <w:t>мынадай</w:t>
+      </w:r>
+      <w:proofErr w:type="spellEnd"/>
+      <w:r>
+        <w:rPr>
+          <w:lang w:val="en-US"/>
+        </w:rPr>
+        <w:t xml:space="preserve"> </w:t>
+      </w:r>
+      <w:proofErr w:type="spellStart"/>
+      <w:r>
+        <w:t>түрде</w:t>
+      </w:r>
+      <w:proofErr w:type="spellEnd"/>
+      <w:r>
+        <w:rPr>
+          <w:lang w:val="en-US"/>
+        </w:rPr>
+        <w:t xml:space="preserve"> </w:t>
+      </w:r>
+      <w:proofErr w:type="spellStart"/>
+      <w:r>
+        <w:t>жүзеге</w:t>
+      </w:r>
+      <w:proofErr w:type="spellEnd"/>
+      <w:r>
+        <w:rPr>
+          <w:lang w:val="en-US"/>
+        </w:rPr>
+        <w:t xml:space="preserve"> </w:t>
+      </w:r>
+      <w:proofErr w:type="spellStart"/>
+      <w:r>
+        <w:t>асырылады</w:t>
+      </w:r>
+      <w:proofErr w:type="spellEnd"/>
+      <w:r>
+        <w:rPr>
+          <w:lang w:val="en-US"/>
+        </w:rPr>
+        <w:t>:</w:t>
+      </w:r>
+    </w:p>
+    <w:p>
+      <w:pPr>
+        <w:rPr>
+          <w:lang w:val="en-US"/>
+        </w:rPr>
+      </w:pPr>
+      <w:r>
+        <w:rPr>
+          <w:lang w:val="en-US"/>
+        </w:rPr>
+        <w:t xml:space="preserve">1) </w:t>
+      </w:r>
+      <w:r>
+        <w:t>Жюри</w:t>
+      </w:r>
+      <w:r>
+        <w:rPr>
+          <w:lang w:val="en-US"/>
+        </w:rPr>
+        <w:t xml:space="preserve"> </w:t>
+      </w:r>
+      <w:proofErr w:type="spellStart"/>
+      <w:r>
+        <w:t>жұмыстарды</w:t>
+      </w:r>
+      <w:proofErr w:type="spellEnd"/>
+      <w:r>
+        <w:rPr>
+          <w:lang w:val="en-US"/>
+        </w:rPr>
+        <w:t xml:space="preserve"> </w:t>
+      </w:r>
+      <w:r>
+        <w:t>Жюри</w:t>
+      </w:r>
+      <w:r>
+        <w:rPr>
+          <w:lang w:val="en-US"/>
+        </w:rPr>
+        <w:t xml:space="preserve"> </w:t>
+      </w:r>
+      <w:proofErr w:type="spellStart"/>
+      <w:r>
+        <w:t>бағалау</w:t>
+      </w:r>
+      <w:proofErr w:type="spellEnd"/>
+      <w:r>
+        <w:rPr>
+          <w:lang w:val="en-US"/>
+        </w:rPr>
+        <w:t xml:space="preserve"> </w:t>
+      </w:r>
+      <w:proofErr w:type="spellStart"/>
+      <w:r>
+        <w:t>бланкіне</w:t>
+      </w:r>
+      <w:proofErr w:type="spellEnd"/>
+      <w:r>
+        <w:rPr>
+          <w:lang w:val="en-US"/>
+        </w:rPr>
+        <w:t xml:space="preserve"> </w:t>
+      </w:r>
+      <w:proofErr w:type="spellStart"/>
+      <w:r>
+        <w:t>сәйкес</w:t>
+      </w:r>
+      <w:proofErr w:type="spellEnd"/>
+      <w:r>
+        <w:rPr>
+          <w:lang w:val="en-US"/>
+        </w:rPr>
+        <w:t xml:space="preserve"> </w:t>
+      </w:r>
+      <w:proofErr w:type="spellStart"/>
+      <w:r>
+        <w:t>бағалайды</w:t>
+      </w:r>
+      <w:proofErr w:type="spellEnd"/>
+      <w:r>
+        <w:rPr>
+          <w:lang w:val="en-US"/>
+        </w:rPr>
+        <w:t>, 1-</w:t>
+      </w:r>
+      <w:proofErr w:type="spellStart"/>
+      <w:r>
+        <w:t>қосымшаны</w:t>
+      </w:r>
+      <w:proofErr w:type="spellEnd"/>
+      <w:r>
+        <w:rPr>
+          <w:lang w:val="en-US"/>
+        </w:rPr>
+        <w:t xml:space="preserve"> </w:t>
+      </w:r>
+      <w:proofErr w:type="spellStart"/>
+      <w:r>
+        <w:t>қараңыз</w:t>
+      </w:r>
+      <w:proofErr w:type="spellEnd"/>
+      <w:r>
+        <w:rPr>
+          <w:lang w:val="en-US"/>
+        </w:rPr>
+        <w:t>.</w:t>
       </w:r>
     </w:p>
     <w:p>
@@ -1026,108 +1849,250 @@
         <w:ind w:left="720" w:firstLine="0"/>
       </w:pPr>
       <w:r>
-        <w:t xml:space="preserve">2) Номинацияға байланысты баллдар коэффициенттермен есептеледі. </w:t>
+        <w:t xml:space="preserve">2) </w:t>
+      </w:r>
+      <w:proofErr w:type="spellStart"/>
+      <w:r>
+        <w:t>Номинацияға</w:t>
+      </w:r>
+      <w:proofErr w:type="spellEnd"/>
+      <w:r>
+        <w:t xml:space="preserve"> </w:t>
+      </w:r>
+      <w:proofErr w:type="spellStart"/>
+      <w:r>
+        <w:t>байланысты</w:t>
+      </w:r>
+      <w:proofErr w:type="spellEnd"/>
+      <w:r>
+        <w:t xml:space="preserve"> </w:t>
+      </w:r>
+      <w:proofErr w:type="spellStart"/>
+      <w:r>
+        <w:t>баллдар</w:t>
+      </w:r>
+      <w:proofErr w:type="spellEnd"/>
+      <w:r>
+        <w:t xml:space="preserve"> </w:t>
+      </w:r>
+      <w:proofErr w:type="spellStart"/>
+      <w:r>
+        <w:t>коэффициенттермен</w:t>
+      </w:r>
+      <w:proofErr w:type="spellEnd"/>
+      <w:r>
+        <w:t xml:space="preserve"> есептеледі. </w:t>
       </w:r>
     </w:p>
     <w:p>
       <w:pPr>
         <w:ind w:left="2880" w:firstLine="0"/>
-      </w:pPr>
-      <w:r>
-        <w:t xml:space="preserve">      Impact award үшін мысал:</w:t>
-      </w:r>
-      <w:proofErr w:type="spellStart"/>
-      <w:r/>
-      <w:proofErr w:type="spellEnd"/>
-      <w:r/>
-      <w:proofErr w:type="spellStart"/>
-      <w:r/>
-      <w:proofErr w:type="spellEnd"/>
-      <w:r/>
+        <w:rPr>
+          <w:lang w:val="en-US"/>
+        </w:rPr>
+      </w:pPr>
+      <w:r>
+        <w:t xml:space="preserve">      </w:t>
+      </w:r>
+      <w:r>
+        <w:rPr>
+          <w:lang w:val="en-US"/>
+        </w:rPr>
+        <w:t xml:space="preserve">Impact award </w:t>
+      </w:r>
+      <w:proofErr w:type="spellStart"/>
+      <w:r>
+        <w:t>үшін</w:t>
+      </w:r>
+      <w:proofErr w:type="spellEnd"/>
+      <w:r>
+        <w:rPr>
+          <w:lang w:val="en-US"/>
+        </w:rPr>
+        <w:t xml:space="preserve"> </w:t>
+      </w:r>
+      <w:proofErr w:type="spellStart"/>
+      <w:r>
+        <w:t>мысал</w:t>
+      </w:r>
+      <w:proofErr w:type="spellEnd"/>
+      <w:r>
+        <w:rPr>
+          <w:lang w:val="en-US"/>
+        </w:rPr>
+        <w:t>:</w:t>
+      </w:r>
     </w:p>
     <w:p>
       <w:pPr>
         <w:ind w:firstLine="0"/>
         <w:jc w:val="center"/>
-      </w:pPr>
-      <w:proofErr w:type="spellStart"/>
-      <w:r>
-        <w:t>Impact*2+Visual*0.5+Tech*0.5+Режиссура</w:t>
-      </w:r>
-      <w:proofErr w:type="spellEnd"/>
-      <w:r/>
-      <w:proofErr w:type="spellStart"/>
-      <w:r/>
-      <w:proofErr w:type="spellEnd"/>
-      <w:r/>
+        <w:rPr>
+          <w:lang w:val="en-US"/>
+        </w:rPr>
+      </w:pPr>
+      <w:r>
+        <w:rPr>
+          <w:lang w:val="en-US"/>
+        </w:rPr>
+        <w:t>Impact*2+Tech*0.5+</w:t>
+      </w:r>
+      <w:r>
+        <w:t>Режиссура</w:t>
+      </w:r>
     </w:p>
     <w:p>
       <w:pPr>
         <w:ind w:firstLine="0"/>
         <w:jc w:val="center"/>
-      </w:pPr>
-      <w:r>
-        <w:t>Visual award үшін мысал:</w:t>
+        <w:rPr>
+          <w:lang w:val="en-US"/>
+        </w:rPr>
+      </w:pPr>
+      <w:r>
+        <w:rPr>
+          <w:lang w:val="en-US"/>
+        </w:rPr>
+        <w:t xml:space="preserve">Tech award </w:t>
+      </w:r>
+      <w:proofErr w:type="spellStart"/>
+      <w:r>
+        <w:t>үшін</w:t>
+      </w:r>
+      <w:proofErr w:type="spellEnd"/>
+      <w:r>
+        <w:rPr>
+          <w:lang w:val="en-US"/>
+        </w:rPr>
+        <w:t xml:space="preserve"> </w:t>
+      </w:r>
+      <w:proofErr w:type="spellStart"/>
+      <w:r>
+        <w:t>мысал</w:t>
+      </w:r>
+      <w:proofErr w:type="spellEnd"/>
+      <w:r>
+        <w:rPr>
+          <w:lang w:val="en-US"/>
+        </w:rPr>
+        <w:t>:</w:t>
       </w:r>
     </w:p>
     <w:p>
       <w:pPr>
         <w:ind w:firstLine="0"/>
         <w:jc w:val="center"/>
-      </w:pPr>
-      <w:r>
-        <w:t>Impact*0.5+Visual*2+Tech*0.5+Режиссура</w:t>
+        <w:rPr>
+          <w:lang w:val="en-US"/>
+        </w:rPr>
+      </w:pPr>
+      <w:r>
+        <w:rPr>
+          <w:lang w:val="en-US"/>
+        </w:rPr>
+        <w:t>Impact*0.5</w:t>
+      </w:r>
+      <w:r>
+        <w:rPr>
+          <w:lang w:val="en-US"/>
+        </w:rPr>
+        <w:t xml:space="preserve"> </w:t>
+      </w:r>
+      <w:r>
+        <w:rPr>
+          <w:lang w:val="en-US"/>
+        </w:rPr>
+        <w:t>+Tech*2+</w:t>
+      </w:r>
+      <w:r>
+        <w:t>Режиссура</w:t>
       </w:r>
     </w:p>
     <w:p>
       <w:pPr>
         <w:ind w:firstLine="0"/>
         <w:jc w:val="center"/>
-      </w:pPr>
-      <w:r>
-        <w:t>Tech award үшін мысал:</w:t>
+        <w:rPr>
+          <w:lang w:val="en-US"/>
+        </w:rPr>
+      </w:pPr>
+      <w:proofErr w:type="spellStart"/>
+      <w:r>
+        <w:t>Ерекшелік</w:t>
+      </w:r>
+      <w:proofErr w:type="spellEnd"/>
+      <w:r>
+        <w:rPr>
+          <w:lang w:val="en-US"/>
+        </w:rPr>
+        <w:t xml:space="preserve"> Glorious award </w:t>
+      </w:r>
+      <w:proofErr w:type="spellStart"/>
+      <w:r>
+        <w:t>болып</w:t>
+      </w:r>
+      <w:proofErr w:type="spellEnd"/>
+      <w:r>
+        <w:rPr>
+          <w:lang w:val="en-US"/>
+        </w:rPr>
+        <w:t xml:space="preserve"> </w:t>
+      </w:r>
+      <w:proofErr w:type="spellStart"/>
+      <w:r>
+        <w:t>табылады</w:t>
+      </w:r>
+      <w:proofErr w:type="spellEnd"/>
+      <w:r>
+        <w:rPr>
+          <w:lang w:val="en-US"/>
+        </w:rPr>
+        <w:t>:</w:t>
       </w:r>
     </w:p>
     <w:p>
       <w:pPr>
         <w:ind w:firstLine="0"/>
         <w:jc w:val="center"/>
-      </w:pPr>
-      <w:r>
-        <w:t>Impact*0.5+Visual*0.5+Tech*2+Режиссура</w:t>
+        <w:rPr>
+          <w:lang w:val="en-US"/>
+        </w:rPr>
+      </w:pPr>
+      <w:proofErr w:type="spellStart"/>
+      <w:r>
+        <w:rPr>
+          <w:lang w:val="en-US"/>
+        </w:rPr>
+        <w:t>Impact+Tech</w:t>
+      </w:r>
+      <w:proofErr w:type="spellEnd"/>
+      <w:r>
+        <w:rPr>
+          <w:lang w:val="en-US"/>
+        </w:rPr>
+        <w:t>+</w:t>
+      </w:r>
+      <w:r>
+        <w:t>Режиссура</w:t>
       </w:r>
     </w:p>
     <w:p>
       <w:pPr>
         <w:ind w:firstLine="0"/>
-        <w:jc w:val="center"/>
-      </w:pPr>
-      <w:r>
-        <w:t>Ерекшелік Glorious award болып табылады:</w:t>
-      </w:r>
-    </w:p>
-    <w:p>
-      <w:pPr>
-        <w:ind w:firstLine="0"/>
-        <w:jc w:val="center"/>
-      </w:pPr>
-      <w:r>
-        <w:t>Impact+Visual+Tech+Режиссура</w:t>
-      </w:r>
-    </w:p>
-    <w:p>
-      <w:pPr>
-        <w:ind w:firstLine="0"/>
-      </w:pPr>
-    </w:p>
-    <w:p>
-      <w:pPr>
-        <w:pStyle w:val="Heading2"/>
+        <w:rPr>
+          <w:lang w:val="en-US"/>
+        </w:rPr>
+      </w:pPr>
+    </w:p>
+    <w:p>
+      <w:pPr>
+        <w:pStyle w:val="2"/>
         <w:keepNext/>
         <w:rPr>
           <w:bCs w:val="0"/>
           <w:sz w:val="36"/>
           <w:szCs w:val="36"/>
+          <w:lang w:val="en-US"/>
         </w:rPr>
       </w:pPr>
       <w:r>
@@ -1135,28 +2100,406 @@
           <w:bCs w:val="0"/>
           <w:sz w:val="36"/>
           <w:szCs w:val="36"/>
-        </w:rPr>
-        <w:t>13-бап. Бұзушылықтар және санкциялар</w:t>
-      </w:r>
-    </w:p>
-    <w:p>
-      <w:r>
-        <w:t>1. Осы Ереже бұзылған жағдайда Ұйымдастыру комитеті немесе жюри тәртіптік ықпал ету шараларын қолданады.</w:t>
-      </w:r>
-    </w:p>
-    <w:p>
-      <w:r>
-        <w:t>2. Бұзушылықтарға мыналар жатады:</w:t>
-      </w:r>
-    </w:p>
-    <w:p>
-      <w:r>
-        <w:t>1) қатысу шарттарын, өтінім беру мерзімдерін немесе техникалық талаптарды сақтамау;</w:t>
-      </w:r>
-    </w:p>
-    <w:p>
-      <w:r>
-        <w:t>2) команда, фильм авторлары немесе пайдаланылған материалдар туралы дұрыс емес ақпарат беру;</w:t>
+          <w:lang w:val="en-US"/>
+        </w:rPr>
+        <w:t>13-</w:t>
+      </w:r>
+      <w:proofErr w:type="spellStart"/>
+      <w:r>
+        <w:rPr>
+          <w:bCs w:val="0"/>
+          <w:sz w:val="36"/>
+          <w:szCs w:val="36"/>
+        </w:rPr>
+        <w:t>бап</w:t>
+      </w:r>
+      <w:proofErr w:type="spellEnd"/>
+      <w:r>
+        <w:rPr>
+          <w:bCs w:val="0"/>
+          <w:sz w:val="36"/>
+          <w:szCs w:val="36"/>
+          <w:lang w:val="en-US"/>
+        </w:rPr>
+        <w:t xml:space="preserve">. </w:t>
+      </w:r>
+      <w:proofErr w:type="spellStart"/>
+      <w:r>
+        <w:rPr>
+          <w:bCs w:val="0"/>
+          <w:sz w:val="36"/>
+          <w:szCs w:val="36"/>
+        </w:rPr>
+        <w:t>Бұзушылықтар</w:t>
+      </w:r>
+      <w:proofErr w:type="spellEnd"/>
+      <w:r>
+        <w:rPr>
+          <w:bCs w:val="0"/>
+          <w:sz w:val="36"/>
+          <w:szCs w:val="36"/>
+          <w:lang w:val="en-US"/>
+        </w:rPr>
+        <w:t xml:space="preserve"> </w:t>
+      </w:r>
+      <w:proofErr w:type="spellStart"/>
+      <w:r>
+        <w:rPr>
+          <w:bCs w:val="0"/>
+          <w:sz w:val="36"/>
+          <w:szCs w:val="36"/>
+        </w:rPr>
+        <w:t>және</w:t>
+      </w:r>
+      <w:proofErr w:type="spellEnd"/>
+      <w:r>
+        <w:rPr>
+          <w:bCs w:val="0"/>
+          <w:sz w:val="36"/>
+          <w:szCs w:val="36"/>
+          <w:lang w:val="en-US"/>
+        </w:rPr>
+        <w:t xml:space="preserve"> </w:t>
+      </w:r>
+      <w:proofErr w:type="spellStart"/>
+      <w:r>
+        <w:rPr>
+          <w:bCs w:val="0"/>
+          <w:sz w:val="36"/>
+          <w:szCs w:val="36"/>
+        </w:rPr>
+        <w:t>санкциялар</w:t>
+      </w:r>
+      <w:proofErr w:type="spellEnd"/>
+    </w:p>
+    <w:p>
+      <w:pPr>
+        <w:rPr>
+          <w:lang w:val="en-US"/>
+        </w:rPr>
+      </w:pPr>
+      <w:r>
+        <w:rPr>
+          <w:lang w:val="en-US"/>
+        </w:rPr>
+        <w:t xml:space="preserve">1. </w:t>
+      </w:r>
+      <w:r>
+        <w:t>Осы</w:t>
+      </w:r>
+      <w:r>
+        <w:rPr>
+          <w:lang w:val="en-US"/>
+        </w:rPr>
+        <w:t xml:space="preserve"> </w:t>
+      </w:r>
+      <w:proofErr w:type="spellStart"/>
+      <w:r>
+        <w:t>Ереже</w:t>
+      </w:r>
+      <w:proofErr w:type="spellEnd"/>
+      <w:r>
+        <w:rPr>
+          <w:lang w:val="en-US"/>
+        </w:rPr>
+        <w:t xml:space="preserve"> </w:t>
+      </w:r>
+      <w:proofErr w:type="spellStart"/>
+      <w:r>
+        <w:t>бұзылған</w:t>
+      </w:r>
+      <w:proofErr w:type="spellEnd"/>
+      <w:r>
+        <w:rPr>
+          <w:lang w:val="en-US"/>
+        </w:rPr>
+        <w:t xml:space="preserve"> </w:t>
+      </w:r>
+      <w:proofErr w:type="spellStart"/>
+      <w:r>
+        <w:t>жағдайда</w:t>
+      </w:r>
+      <w:proofErr w:type="spellEnd"/>
+      <w:r>
+        <w:rPr>
+          <w:lang w:val="en-US"/>
+        </w:rPr>
+        <w:t xml:space="preserve"> </w:t>
+      </w:r>
+      <w:proofErr w:type="spellStart"/>
+      <w:r>
+        <w:t>Ұйымдастыру</w:t>
+      </w:r>
+      <w:proofErr w:type="spellEnd"/>
+      <w:r>
+        <w:rPr>
+          <w:lang w:val="en-US"/>
+        </w:rPr>
+        <w:t xml:space="preserve"> </w:t>
+      </w:r>
+      <w:proofErr w:type="spellStart"/>
+      <w:r>
+        <w:t>комитеті</w:t>
+      </w:r>
+      <w:proofErr w:type="spellEnd"/>
+      <w:r>
+        <w:rPr>
+          <w:lang w:val="en-US"/>
+        </w:rPr>
+        <w:t xml:space="preserve"> </w:t>
+      </w:r>
+      <w:proofErr w:type="spellStart"/>
+      <w:r>
+        <w:t>немесе</w:t>
+      </w:r>
+      <w:proofErr w:type="spellEnd"/>
+      <w:r>
+        <w:rPr>
+          <w:lang w:val="en-US"/>
+        </w:rPr>
+        <w:t xml:space="preserve"> </w:t>
+      </w:r>
+      <w:r>
+        <w:t>жюри</w:t>
+      </w:r>
+      <w:r>
+        <w:rPr>
+          <w:lang w:val="en-US"/>
+        </w:rPr>
+        <w:t xml:space="preserve"> </w:t>
+      </w:r>
+      <w:proofErr w:type="spellStart"/>
+      <w:r>
+        <w:t>тәртіптік</w:t>
+      </w:r>
+      <w:proofErr w:type="spellEnd"/>
+      <w:r>
+        <w:rPr>
+          <w:lang w:val="en-US"/>
+        </w:rPr>
+        <w:t xml:space="preserve"> </w:t>
+      </w:r>
+      <w:proofErr w:type="spellStart"/>
+      <w:r>
+        <w:t>ықпал</w:t>
+      </w:r>
+      <w:proofErr w:type="spellEnd"/>
+      <w:r>
+        <w:rPr>
+          <w:lang w:val="en-US"/>
+        </w:rPr>
+        <w:t xml:space="preserve"> </w:t>
+      </w:r>
+      <w:proofErr w:type="spellStart"/>
+      <w:r>
+        <w:t>ету</w:t>
+      </w:r>
+      <w:proofErr w:type="spellEnd"/>
+      <w:r>
+        <w:rPr>
+          <w:lang w:val="en-US"/>
+        </w:rPr>
+        <w:t xml:space="preserve"> </w:t>
+      </w:r>
+      <w:proofErr w:type="spellStart"/>
+      <w:r>
+        <w:t>шараларын</w:t>
+      </w:r>
+      <w:proofErr w:type="spellEnd"/>
+      <w:r>
+        <w:rPr>
+          <w:lang w:val="en-US"/>
+        </w:rPr>
+        <w:t xml:space="preserve"> </w:t>
+      </w:r>
+      <w:proofErr w:type="spellStart"/>
+      <w:r>
+        <w:t>қолданады</w:t>
+      </w:r>
+      <w:proofErr w:type="spellEnd"/>
+      <w:r>
+        <w:rPr>
+          <w:lang w:val="en-US"/>
+        </w:rPr>
+        <w:t>.</w:t>
+      </w:r>
+    </w:p>
+    <w:p>
+      <w:pPr>
+        <w:rPr>
+          <w:lang w:val="en-US"/>
+        </w:rPr>
+      </w:pPr>
+      <w:r>
+        <w:rPr>
+          <w:lang w:val="en-US"/>
+        </w:rPr>
+        <w:t xml:space="preserve">2. </w:t>
+      </w:r>
+      <w:proofErr w:type="spellStart"/>
+      <w:r>
+        <w:t>Бұзушылықтарға</w:t>
+      </w:r>
+      <w:proofErr w:type="spellEnd"/>
+      <w:r>
+        <w:rPr>
+          <w:lang w:val="en-US"/>
+        </w:rPr>
+        <w:t xml:space="preserve"> </w:t>
+      </w:r>
+      <w:proofErr w:type="spellStart"/>
+      <w:r>
+        <w:t>мыналар</w:t>
+      </w:r>
+      <w:proofErr w:type="spellEnd"/>
+      <w:r>
+        <w:rPr>
+          <w:lang w:val="en-US"/>
+        </w:rPr>
+        <w:t xml:space="preserve"> </w:t>
+      </w:r>
+      <w:proofErr w:type="spellStart"/>
+      <w:r>
+        <w:t>жатады</w:t>
+      </w:r>
+      <w:proofErr w:type="spellEnd"/>
+      <w:r>
+        <w:rPr>
+          <w:lang w:val="en-US"/>
+        </w:rPr>
+        <w:t>:</w:t>
+      </w:r>
+    </w:p>
+    <w:p>
+      <w:pPr>
+        <w:rPr>
+          <w:lang w:val="en-US"/>
+        </w:rPr>
+      </w:pPr>
+      <w:r>
+        <w:rPr>
+          <w:lang w:val="en-US"/>
+        </w:rPr>
+        <w:t xml:space="preserve">1) </w:t>
+      </w:r>
+      <w:proofErr w:type="spellStart"/>
+      <w:r>
+        <w:t>қатысу</w:t>
+      </w:r>
+      <w:proofErr w:type="spellEnd"/>
+      <w:r>
+        <w:rPr>
+          <w:lang w:val="en-US"/>
+        </w:rPr>
+        <w:t xml:space="preserve"> </w:t>
+      </w:r>
+      <w:proofErr w:type="spellStart"/>
+      <w:r>
+        <w:t>шарттарын</w:t>
+      </w:r>
+      <w:proofErr w:type="spellEnd"/>
+      <w:r>
+        <w:rPr>
+          <w:lang w:val="en-US"/>
+        </w:rPr>
+        <w:t xml:space="preserve">, </w:t>
+      </w:r>
+      <w:proofErr w:type="spellStart"/>
+      <w:r>
+        <w:t>өтінім</w:t>
+      </w:r>
+      <w:proofErr w:type="spellEnd"/>
+      <w:r>
+        <w:rPr>
+          <w:lang w:val="en-US"/>
+        </w:rPr>
+        <w:t xml:space="preserve"> </w:t>
+      </w:r>
+      <w:r>
+        <w:t>беру</w:t>
+      </w:r>
+      <w:r>
+        <w:rPr>
+          <w:lang w:val="en-US"/>
+        </w:rPr>
+        <w:t xml:space="preserve"> </w:t>
+      </w:r>
+      <w:proofErr w:type="spellStart"/>
+      <w:r>
+        <w:t>мерзімдерін</w:t>
+      </w:r>
+      <w:proofErr w:type="spellEnd"/>
+      <w:r>
+        <w:rPr>
+          <w:lang w:val="en-US"/>
+        </w:rPr>
+        <w:t xml:space="preserve"> </w:t>
+      </w:r>
+      <w:proofErr w:type="spellStart"/>
+      <w:r>
+        <w:t>немесе</w:t>
+      </w:r>
+      <w:proofErr w:type="spellEnd"/>
+      <w:r>
+        <w:rPr>
+          <w:lang w:val="en-US"/>
+        </w:rPr>
+        <w:t xml:space="preserve"> </w:t>
+      </w:r>
+      <w:proofErr w:type="spellStart"/>
+      <w:r>
+        <w:t>техникалық</w:t>
+      </w:r>
+      <w:proofErr w:type="spellEnd"/>
+      <w:r>
+        <w:rPr>
+          <w:lang w:val="en-US"/>
+        </w:rPr>
+        <w:t xml:space="preserve"> </w:t>
+      </w:r>
+      <w:proofErr w:type="spellStart"/>
+      <w:r>
+        <w:t>талаптарды</w:t>
+      </w:r>
+      <w:proofErr w:type="spellEnd"/>
+      <w:r>
+        <w:rPr>
+          <w:lang w:val="en-US"/>
+        </w:rPr>
+        <w:t xml:space="preserve"> </w:t>
+      </w:r>
+      <w:proofErr w:type="spellStart"/>
+      <w:r>
+        <w:t>сақтамау</w:t>
+      </w:r>
+      <w:proofErr w:type="spellEnd"/>
+      <w:r>
+        <w:rPr>
+          <w:lang w:val="en-US"/>
+        </w:rPr>
+        <w:t>;</w:t>
+      </w:r>
+    </w:p>
+    <w:p>
+      <w:r>
+        <w:lastRenderedPageBreak/>
+        <w:t xml:space="preserve">2) команда, фильм </w:t>
+      </w:r>
+      <w:proofErr w:type="spellStart"/>
+      <w:r>
+        <w:t>авторлары</w:t>
+      </w:r>
+      <w:proofErr w:type="spellEnd"/>
+      <w:r>
+        <w:t xml:space="preserve"> </w:t>
+      </w:r>
+      <w:proofErr w:type="spellStart"/>
+      <w:r>
+        <w:t>немесе</w:t>
+      </w:r>
+      <w:proofErr w:type="spellEnd"/>
+      <w:r>
+        <w:t xml:space="preserve"> пайдаланылған материалдар туралы дұрыс емес ақпарат беру;</w:t>
       </w:r>
     </w:p>
     <w:p>
@@ -1251,7 +2594,7 @@
     </w:p>
     <w:p>
       <w:pPr>
-        <w:pStyle w:val="Heading2"/>
+        <w:pStyle w:val="2"/>
         <w:keepNext/>
         <w:rPr>
           <w:bCs w:val="0"/>
@@ -1295,9 +2638,9 @@
         <w:tblLook w:val="04A0" w:firstRow="1" w:lastRow="0" w:firstColumn="1" w:lastColumn="0" w:noHBand="0" w:noVBand="1"/>
       </w:tblPr>
       <w:tblGrid>
-        <w:gridCol w:w="3130"/>
+        <w:gridCol w:w="3116"/>
         <w:gridCol w:w="3576"/>
-        <w:gridCol w:w="3046"/>
+        <w:gridCol w:w="3060"/>
       </w:tblGrid>
       <w:tr>
         <w:trPr>
@@ -1322,10 +2665,33 @@
             </w:pPr>
             <w:proofErr w:type="spellStart"/>
             <w:r>
-              <w:t>Ұйымдастыру комитетінің тең төрайымы</w:t>
+              <w:t>Ұйымдастыру</w:t>
             </w:r>
             <w:proofErr w:type="spellEnd"/>
-            <w:r/>
+            <w:r>
+              <w:t xml:space="preserve"> </w:t>
+            </w:r>
+            <w:proofErr w:type="spellStart"/>
+            <w:r>
+              <w:t>комитетінің</w:t>
+            </w:r>
+            <w:proofErr w:type="spellEnd"/>
+            <w:r>
+              <w:t xml:space="preserve"> </w:t>
+            </w:r>
+            <w:proofErr w:type="spellStart"/>
+            <w:r>
+              <w:t>тең</w:t>
+            </w:r>
+            <w:proofErr w:type="spellEnd"/>
+            <w:r>
+              <w:t xml:space="preserve"> </w:t>
+            </w:r>
+            <w:proofErr w:type="spellStart"/>
+            <w:r>
+              <w:t>төрайымы</w:t>
+            </w:r>
+            <w:proofErr w:type="spellEnd"/>
           </w:p>
         </w:tc>
         <w:tc>
@@ -1639,7 +3005,7 @@
     </w:p>
     <w:p>
       <w:pPr>
-        <w:pStyle w:val="Heading1"/>
+        <w:pStyle w:val="1"/>
         <w:keepNext/>
       </w:pPr>
       <w:r>
@@ -1653,7 +3019,7 @@
     <w:p/>
     <w:tbl>
       <w:tblPr>
-        <w:tblStyle w:val="TableGrid"/>
+        <w:tblStyle w:val="ab"/>
         <w:tblW w:w="5000" w:type="pct"/>
         <w:jc w:val="center"/>
         <w:tblLayout w:type="fixed"/>
@@ -1678,7 +3044,7 @@
         </w:trPr>
         <w:tc>
           <w:tcPr>
-            <w:tcW w:w="2835" w:type="dxa"/>
+            <w:tcW w:w="2866" w:type="dxa"/>
             <w:shd w:val="clear" w:color="auto" w:fill="D9D9D9"/>
           </w:tcPr>
           <w:p>
@@ -1696,7 +3062,7 @@
         </w:tc>
         <w:tc>
           <w:tcPr>
-            <w:tcW w:w="1020" w:type="dxa"/>
+            <w:tcW w:w="1031" w:type="dxa"/>
             <w:shd w:val="clear" w:color="auto" w:fill="D9D9D9"/>
           </w:tcPr>
           <w:p>
@@ -1714,7 +3080,7 @@
         </w:tc>
         <w:tc>
           <w:tcPr>
-            <w:tcW w:w="5783" w:type="dxa"/>
+            <w:tcW w:w="5845" w:type="dxa"/>
             <w:shd w:val="clear" w:color="auto" w:fill="D9D9D9"/>
           </w:tcPr>
           <w:p>
@@ -1738,7 +3104,7 @@
         </w:trPr>
         <w:tc>
           <w:tcPr>
-            <w:tcW w:w="2835" w:type="dxa"/>
+            <w:tcW w:w="2866" w:type="dxa"/>
           </w:tcPr>
           <w:p>
             <w:pPr>
@@ -1762,7 +3128,7 @@
         </w:tc>
         <w:tc>
           <w:tcPr>
-            <w:tcW w:w="1020" w:type="dxa"/>
+            <w:tcW w:w="1031" w:type="dxa"/>
           </w:tcPr>
           <w:p>
             <w:pPr>
@@ -1778,7 +3144,7 @@
         </w:tc>
         <w:tc>
           <w:tcPr>
-            <w:tcW w:w="5783" w:type="dxa"/>
+            <w:tcW w:w="5845" w:type="dxa"/>
           </w:tcPr>
           <w:p>
             <w:r>
@@ -1813,7 +3179,7 @@
         </w:trPr>
         <w:tc>
           <w:tcPr>
-            <w:tcW w:w="2835" w:type="dxa"/>
+            <w:tcW w:w="2866" w:type="dxa"/>
           </w:tcPr>
           <w:p>
             <w:pPr>
@@ -1837,7 +3203,7 @@
         </w:tc>
         <w:tc>
           <w:tcPr>
-            <w:tcW w:w="1020" w:type="dxa"/>
+            <w:tcW w:w="1031" w:type="dxa"/>
           </w:tcPr>
           <w:p>
             <w:pPr>
@@ -1853,7 +3219,7 @@
         </w:tc>
         <w:tc>
           <w:tcPr>
-            <w:tcW w:w="5783" w:type="dxa"/>
+            <w:tcW w:w="5845" w:type="dxa"/>
           </w:tcPr>
           <w:p>
             <w:r>
@@ -1888,7 +3254,7 @@
         </w:trPr>
         <w:tc>
           <w:tcPr>
-            <w:tcW w:w="2835" w:type="dxa"/>
+            <w:tcW w:w="2866" w:type="dxa"/>
           </w:tcPr>
           <w:p>
             <w:pPr>
@@ -1912,7 +3278,7 @@
         </w:tc>
         <w:tc>
           <w:tcPr>
-            <w:tcW w:w="1020" w:type="dxa"/>
+            <w:tcW w:w="1031" w:type="dxa"/>
           </w:tcPr>
           <w:p>
             <w:pPr>
@@ -1928,7 +3294,7 @@
         </w:tc>
         <w:tc>
           <w:tcPr>
-            <w:tcW w:w="5783" w:type="dxa"/>
+            <w:tcW w:w="5845" w:type="dxa"/>
           </w:tcPr>
           <w:p>
             <w:r>
@@ -1963,7 +3329,7 @@
         </w:trPr>
         <w:tc>
           <w:tcPr>
-            <w:tcW w:w="2835" w:type="dxa"/>
+            <w:tcW w:w="2866" w:type="dxa"/>
           </w:tcPr>
           <w:p>
             <w:pPr>
@@ -1987,7 +3353,7 @@
         </w:tc>
         <w:tc>
           <w:tcPr>
-            <w:tcW w:w="1020" w:type="dxa"/>
+            <w:tcW w:w="1031" w:type="dxa"/>
           </w:tcPr>
           <w:p>
             <w:pPr>
@@ -2003,7 +3369,7 @@
         </w:tc>
         <w:tc>
           <w:tcPr>
-            <w:tcW w:w="5783" w:type="dxa"/>
+            <w:tcW w:w="5845" w:type="dxa"/>
           </w:tcPr>
           <w:p>
             <w:r>
@@ -2038,7 +3404,7 @@
         </w:trPr>
         <w:tc>
           <w:tcPr>
-            <w:tcW w:w="2835" w:type="dxa"/>
+            <w:tcW w:w="2866" w:type="dxa"/>
           </w:tcPr>
           <w:p>
             <w:pPr>
@@ -2048,7 +3414,7 @@
               <w:rPr>
                 <w:sz w:val="17"/>
               </w:rPr>
-              <w:t>VISUAL</w:t>
+              <w:t>TECH</w:t>
             </w:r>
           </w:p>
           <w:p>
@@ -2056,13 +3422,19 @@
               <w:rPr>
                 <w:sz w:val="17"/>
               </w:rPr>
-              <w:t>5. Операторлық жұмыс және кадр композициясы</w:t>
+              <w:t>5</w:t>
+            </w:r>
+            <w:r>
+              <w:rPr>
+                <w:sz w:val="17"/>
+              </w:rPr>
+              <w:t>. Техникалық күрделілік және тапқырлық</w:t>
             </w:r>
           </w:p>
         </w:tc>
         <w:tc>
           <w:tcPr>
-            <w:tcW w:w="1020" w:type="dxa"/>
+            <w:tcW w:w="1031" w:type="dxa"/>
           </w:tcPr>
           <w:p>
             <w:pPr>
@@ -2078,14 +3450,14 @@
         </w:tc>
         <w:tc>
           <w:tcPr>
-            <w:tcW w:w="5783" w:type="dxa"/>
+            <w:tcW w:w="5845" w:type="dxa"/>
           </w:tcPr>
           <w:p>
             <w:r>
               <w:rPr>
                 <w:sz w:val="17"/>
               </w:rPr>
-              <w:t>0–2 — кадрлар кездейсоқ, композиция әлсіз, камера қабылдауға кедергі келтіреді</w:t>
+              <w:t>0–2 — күрделі техникалық шешімдер дерлік жоқ немесе олар сәтсіз орындалған</w:t>
             </w:r>
           </w:p>
           <w:p>
@@ -2093,7 +3465,7 @@
               <w:rPr>
                 <w:sz w:val="17"/>
               </w:rPr>
-              <w:t>3–5 — камера жұмысы түсінікті, сәтті кадрлар бар, бірақ шешім әрдайым саналы емес</w:t>
+              <w:t>3–5 — қызықты талпыныстар бар, бірақ іске асыру кей жерлерде біркелкі емес немесе соңына дейін ойластырылмаған</w:t>
             </w:r>
           </w:p>
           <w:p>
@@ -2101,7 +3473,7 @@
               <w:rPr>
                 <w:sz w:val="17"/>
               </w:rPr>
-              <w:t>6–8 — кадр ойластырылған; камера оқиғаны, атмосфераны және кейіпкерлердің күйін ашады</w:t>
+              <w:t>6–8 — техникалық тапқырлықтың жоғары деңгейі көрінеді; фильм “бұл қалай түсірілген?” деген әсер қалдырады</w:t>
             </w:r>
           </w:p>
         </w:tc>
@@ -2113,7 +3485,7 @@
         </w:trPr>
         <w:tc>
           <w:tcPr>
-            <w:tcW w:w="2835" w:type="dxa"/>
+            <w:tcW w:w="2866" w:type="dxa"/>
           </w:tcPr>
           <w:p>
             <w:pPr>
@@ -2123,7 +3495,7 @@
               <w:rPr>
                 <w:sz w:val="17"/>
               </w:rPr>
-              <w:t>VISUAL</w:t>
+              <w:t>TECH</w:t>
             </w:r>
           </w:p>
           <w:p>
@@ -2131,13 +3503,19 @@
               <w:rPr>
                 <w:sz w:val="17"/>
               </w:rPr>
-              <w:t>6. Жарық, түс және визуалды стиль</w:t>
+              <w:t>6</w:t>
+            </w:r>
+            <w:r>
+              <w:rPr>
+                <w:sz w:val="17"/>
+              </w:rPr>
+              <w:t>. Монтаж, ырғақ және фильмнің жинақталуы</w:t>
             </w:r>
           </w:p>
         </w:tc>
         <w:tc>
           <w:tcPr>
-            <w:tcW w:w="1020" w:type="dxa"/>
+            <w:tcW w:w="1031" w:type="dxa"/>
           </w:tcPr>
           <w:p>
             <w:pPr>
@@ -2153,14 +3531,14 @@
         </w:tc>
         <w:tc>
           <w:tcPr>
-            <w:tcW w:w="5783" w:type="dxa"/>
+            <w:tcW w:w="5845" w:type="dxa"/>
           </w:tcPr>
           <w:p>
             <w:r>
               <w:rPr>
                 <w:sz w:val="17"/>
               </w:rPr>
-              <w:t>0–2 — жарық пен түс кездейсоқ немесе техникалық тұрғыдан көруге кедергі келтіреді; көрініс ұқыпсыз</w:t>
+              <w:t>0–2 — монтаж түсінуге кедергі келтіреді, фильм созылыңқы немесе хаосты</w:t>
             </w:r>
           </w:p>
           <w:p>
@@ -2168,7 +3546,7 @@
               <w:rPr>
                 <w:sz w:val="17"/>
               </w:rPr>
-              <w:t>3–5 — стиль жасауға талпыныс бар, бірақ ол әрдайым сақталмайды немесе толық жұмыс істемейді</w:t>
+              <w:t>3–5 — монтаж жалпы жұмыс істейді, бірақ баяулау тұстар, күрт ауысулар немесе артық сахналар бар</w:t>
             </w:r>
           </w:p>
           <w:p>
@@ -2176,7 +3554,7 @@
               <w:rPr>
                 <w:sz w:val="17"/>
               </w:rPr>
-              <w:t>6–8 — жарық пен түс әсерлі атмосфера қалыптастырып, фильмді визуалды түрде тұтас етеді</w:t>
+              <w:t>6–8 — монтаж дәл, ырғақ назарды ұстайды, сахналар мағыналы байланысқан</w:t>
             </w:r>
           </w:p>
         </w:tc>
@@ -2188,7 +3566,7 @@
         </w:trPr>
         <w:tc>
           <w:tcPr>
-            <w:tcW w:w="2835" w:type="dxa"/>
+            <w:tcW w:w="2866" w:type="dxa"/>
           </w:tcPr>
           <w:p>
             <w:pPr>
@@ -2198,7 +3576,7 @@
               <w:rPr>
                 <w:sz w:val="17"/>
               </w:rPr>
-              <w:t>VISUAL</w:t>
+              <w:t>TECH</w:t>
             </w:r>
           </w:p>
           <w:p>
@@ -2206,13 +3584,19 @@
               <w:rPr>
                 <w:sz w:val="17"/>
               </w:rPr>
-              <w:t>7. Көркемдік безендіру: локациялар, костюмдер, реквизит</w:t>
+              <w:t>7</w:t>
+            </w:r>
+            <w:r>
+              <w:rPr>
+                <w:sz w:val="17"/>
+              </w:rPr>
+              <w:t>. Дыбыс, музыка және дыбыстық атмосфера</w:t>
             </w:r>
           </w:p>
         </w:tc>
         <w:tc>
           <w:tcPr>
-            <w:tcW w:w="1020" w:type="dxa"/>
+            <w:tcW w:w="1031" w:type="dxa"/>
           </w:tcPr>
           <w:p>
             <w:pPr>
@@ -2228,14 +3612,14 @@
         </w:tc>
         <w:tc>
           <w:tcPr>
-            <w:tcW w:w="5783" w:type="dxa"/>
+            <w:tcW w:w="5845" w:type="dxa"/>
           </w:tcPr>
           <w:p>
             <w:r>
               <w:rPr>
                 <w:sz w:val="17"/>
               </w:rPr>
-              <w:t>0–2 — фильм кеңістігі кездейсоқ; локациялар, костюмдер мен реквизит оқиғаға көмектеспейді</w:t>
+              <w:t>0–2 — сөз нашар естіледі, музыка кедергі келтіреді, шулар кездейсоқ немесе ұқыпсыз</w:t>
             </w:r>
           </w:p>
           <w:p>
@@ -2243,7 +3627,7 @@
               <w:rPr>
                 <w:sz w:val="17"/>
               </w:rPr>
-              <w:t>3–5 — сәтті детальдар бар, бірақ фильм әлемі толық жиналмаған</w:t>
+              <w:t>3–5 — дыбыс түсінікті, бірақ әрдайым таза немесе әсерлі емес</w:t>
             </w:r>
           </w:p>
           <w:p>
@@ -2251,7 +3635,7 @@
               <w:rPr>
                 <w:sz w:val="17"/>
               </w:rPr>
-              <w:t>6–8 — безендіру атмосфераны, мінездерді және мағынаны күшейтеді; детальдар саналы түрде жұмыс істейді</w:t>
+              <w:t>6–8 — музыка, тыныштық, шулар мен сөз атмосфера құрып, эмоцияны күшейтеді</w:t>
             </w:r>
           </w:p>
         </w:tc>
@@ -2263,7 +3647,7 @@
         </w:trPr>
         <w:tc>
           <w:tcPr>
-            <w:tcW w:w="2835" w:type="dxa"/>
+            <w:tcW w:w="2866" w:type="dxa"/>
           </w:tcPr>
           <w:p>
             <w:pPr>
@@ -2273,7 +3657,7 @@
               <w:rPr>
                 <w:sz w:val="17"/>
               </w:rPr>
-              <w:t>VISUAL</w:t>
+              <w:t>TECH</w:t>
             </w:r>
           </w:p>
           <w:p>
@@ -2281,13 +3665,19 @@
               <w:rPr>
                 <w:sz w:val="17"/>
               </w:rPr>
-              <w:t>8. Фильмнің визуалды тұтастығы</w:t>
+              <w:t>8</w:t>
+            </w:r>
+            <w:r>
+              <w:rPr>
+                <w:sz w:val="17"/>
+              </w:rPr>
+              <w:t>. Постпродакшн: түсті түзету, VFX, титрлер, өңдеу</w:t>
             </w:r>
           </w:p>
         </w:tc>
         <w:tc>
           <w:tcPr>
-            <w:tcW w:w="1020" w:type="dxa"/>
+            <w:tcW w:w="1031" w:type="dxa"/>
           </w:tcPr>
           <w:p>
             <w:pPr>
@@ -2303,14 +3693,14 @@
         </w:tc>
         <w:tc>
           <w:tcPr>
-            <w:tcW w:w="5783" w:type="dxa"/>
+            <w:tcW w:w="5845" w:type="dxa"/>
           </w:tcPr>
           <w:p>
             <w:r>
               <w:rPr>
                 <w:sz w:val="17"/>
               </w:rPr>
-              <w:t>0–2 — визуалды стиль ыдырап кетеді, сахналар өзара байланыссыз көрінеді</w:t>
+              <w:t>0–2 — постпродакшн әлсіз немесе ұқыпсыз; байқалатын техникалық қателер бар</w:t>
             </w:r>
           </w:p>
           <w:p>
@@ -2318,7 +3708,7 @@
               <w:rPr>
                 <w:sz w:val="17"/>
               </w:rPr>
-              <w:t>3–4 — жалпы стиль бар, бірақ кейбір сахналар бөлініп тұрады немесе басқаларына қарағанда әлсіз көрінеді</w:t>
+              <w:t>3–4 — өңдеу қабылдауға болады, бірақ әрдайым ұқыпты немесе стилистикалық тұрғыдан біртұтас емес</w:t>
             </w:r>
           </w:p>
           <w:p>
@@ -2326,7 +3716,7 @@
               <w:rPr>
                 <w:sz w:val="17"/>
               </w:rPr>
-              <w:t>5–6 — көрініс, түс, жарық және безендіру бір бағытта жұмыс істейді</w:t>
+              <w:t>5–6 — финалдық өңдеу ұқыпты, кәсіби көрінеді және фильмді күшейтеді</w:t>
             </w:r>
           </w:p>
         </w:tc>
@@ -2338,7 +3728,7 @@
         </w:trPr>
         <w:tc>
           <w:tcPr>
-            <w:tcW w:w="2835" w:type="dxa"/>
+            <w:tcW w:w="2866" w:type="dxa"/>
           </w:tcPr>
           <w:p>
             <w:pPr>
@@ -2348,21 +3738,29 @@
               <w:rPr>
                 <w:sz w:val="17"/>
               </w:rPr>
-              <w:t>TECH</w:t>
+              <w:lastRenderedPageBreak/>
+              <w:t>GENERAL</w:t>
             </w:r>
           </w:p>
           <w:p>
             <w:r>
               <w:rPr>
                 <w:sz w:val="17"/>
-              </w:rPr>
-              <w:t>9. Техникалық күрделілік және тапқырлық</w:t>
+                <w:lang w:val="en-US"/>
+              </w:rPr>
+              <w:t>9</w:t>
+            </w:r>
+            <w:r>
+              <w:rPr>
+                <w:sz w:val="17"/>
+              </w:rPr>
+              <w:t>. Режиссура және айтылымның тұтастығы</w:t>
             </w:r>
           </w:p>
         </w:tc>
         <w:tc>
           <w:tcPr>
-            <w:tcW w:w="1020" w:type="dxa"/>
+            <w:tcW w:w="1031" w:type="dxa"/>
           </w:tcPr>
           <w:p>
             <w:pPr>
@@ -2372,313 +3770,13 @@
               <w:rPr>
                 <w:sz w:val="17"/>
               </w:rPr>
-              <w:t>/8</w:t>
+              <w:t>/10</w:t>
             </w:r>
           </w:p>
         </w:tc>
         <w:tc>
           <w:tcPr>
-            <w:tcW w:w="5783" w:type="dxa"/>
-          </w:tcPr>
-          <w:p>
-            <w:r>
-              <w:rPr>
-                <w:sz w:val="17"/>
-              </w:rPr>
-              <w:t>0–2 — күрделі техникалық шешімдер дерлік жоқ немесе олар сәтсіз орындалған</w:t>
-            </w:r>
-          </w:p>
-          <w:p>
-            <w:r>
-              <w:rPr>
-                <w:sz w:val="17"/>
-              </w:rPr>
-              <w:t>3–5 — қызықты талпыныстар бар, бірақ іске асыру кей жерлерде біркелкі емес немесе соңына дейін ойластырылмаған</w:t>
-            </w:r>
-          </w:p>
-          <w:p>
-            <w:r>
-              <w:rPr>
-                <w:sz w:val="17"/>
-              </w:rPr>
-              <w:t>6–8 — техникалық тапқырлықтың жоғары деңгейі көрінеді; фильм “бұл қалай түсірілген?” деген әсер қалдырады</w:t>
-            </w:r>
-          </w:p>
-        </w:tc>
-      </w:tr>
-      <w:tr>
-        <w:trPr>
-          <w:cantSplit/>
-          <w:jc w:val="center"/>
-        </w:trPr>
-        <w:tc>
-          <w:tcPr>
-            <w:tcW w:w="2835" w:type="dxa"/>
-          </w:tcPr>
-          <w:p>
-            <w:pPr>
-              <w:jc w:val="center"/>
-            </w:pPr>
-            <w:r>
-              <w:rPr>
-                <w:sz w:val="17"/>
-              </w:rPr>
-              <w:t>TECH</w:t>
-            </w:r>
-          </w:p>
-          <w:p>
-            <w:r>
-              <w:rPr>
-                <w:sz w:val="17"/>
-              </w:rPr>
-              <w:t>10. Монтаж, ырғақ және фильмнің жинақталуы</w:t>
-            </w:r>
-          </w:p>
-        </w:tc>
-        <w:tc>
-          <w:tcPr>
-            <w:tcW w:w="1020" w:type="dxa"/>
-          </w:tcPr>
-          <w:p>
-            <w:pPr>
-              <w:jc w:val="center"/>
-            </w:pPr>
-            <w:r>
-              <w:rPr>
-                <w:sz w:val="17"/>
-              </w:rPr>
-              <w:t>/8</w:t>
-            </w:r>
-          </w:p>
-        </w:tc>
-        <w:tc>
-          <w:tcPr>
-            <w:tcW w:w="5783" w:type="dxa"/>
-          </w:tcPr>
-          <w:p>
-            <w:r>
-              <w:rPr>
-                <w:sz w:val="17"/>
-              </w:rPr>
-              <w:t>0–2 — монтаж түсінуге кедергі келтіреді, фильм созылыңқы немесе хаосты</w:t>
-            </w:r>
-          </w:p>
-          <w:p>
-            <w:r>
-              <w:rPr>
-                <w:sz w:val="17"/>
-              </w:rPr>
-              <w:t>3–5 — монтаж жалпы жұмыс істейді, бірақ баяулау тұстар, күрт ауысулар немесе артық сахналар бар</w:t>
-            </w:r>
-          </w:p>
-          <w:p>
-            <w:r>
-              <w:rPr>
-                <w:sz w:val="17"/>
-              </w:rPr>
-              <w:t>6–8 — монтаж дәл, ырғақ назарды ұстайды, сахналар мағыналы байланысқан</w:t>
-            </w:r>
-          </w:p>
-        </w:tc>
-      </w:tr>
-      <w:tr>
-        <w:trPr>
-          <w:cantSplit/>
-          <w:jc w:val="center"/>
-        </w:trPr>
-        <w:tc>
-          <w:tcPr>
-            <w:tcW w:w="2835" w:type="dxa"/>
-          </w:tcPr>
-          <w:p>
-            <w:pPr>
-              <w:jc w:val="center"/>
-            </w:pPr>
-            <w:r>
-              <w:rPr>
-                <w:sz w:val="17"/>
-              </w:rPr>
-              <w:t>TECH</w:t>
-            </w:r>
-          </w:p>
-          <w:p>
-            <w:r>
-              <w:rPr>
-                <w:sz w:val="17"/>
-              </w:rPr>
-              <w:t>11. Дыбыс, музыка және дыбыстық атмосфера</w:t>
-            </w:r>
-          </w:p>
-        </w:tc>
-        <w:tc>
-          <w:tcPr>
-            <w:tcW w:w="1020" w:type="dxa"/>
-          </w:tcPr>
-          <w:p>
-            <w:pPr>
-              <w:jc w:val="center"/>
-            </w:pPr>
-            <w:r>
-              <w:rPr>
-                <w:sz w:val="17"/>
-              </w:rPr>
-              <w:t>/8</w:t>
-            </w:r>
-          </w:p>
-        </w:tc>
-        <w:tc>
-          <w:tcPr>
-            <w:tcW w:w="5783" w:type="dxa"/>
-          </w:tcPr>
-          <w:p>
-            <w:r>
-              <w:rPr>
-                <w:sz w:val="17"/>
-              </w:rPr>
-              <w:t>0–2 — сөз нашар естіледі, музыка кедергі келтіреді, шулар кездейсоқ немесе ұқыпсыз</w:t>
-            </w:r>
-          </w:p>
-          <w:p>
-            <w:r>
-              <w:rPr>
-                <w:sz w:val="17"/>
-              </w:rPr>
-              <w:t>3–5 — дыбыс түсінікті, бірақ әрдайым таза немесе әсерлі емес</w:t>
-            </w:r>
-          </w:p>
-          <w:p>
-            <w:r>
-              <w:rPr>
-                <w:sz w:val="17"/>
-              </w:rPr>
-              <w:t>6–8 — музыка, тыныштық, шулар мен сөз атмосфера құрып, эмоцияны күшейтеді</w:t>
-            </w:r>
-          </w:p>
-        </w:tc>
-      </w:tr>
-      <w:tr>
-        <w:trPr>
-          <w:cantSplit/>
-          <w:jc w:val="center"/>
-        </w:trPr>
-        <w:tc>
-          <w:tcPr>
-            <w:tcW w:w="2835" w:type="dxa"/>
-          </w:tcPr>
-          <w:p>
-            <w:pPr>
-              <w:jc w:val="center"/>
-            </w:pPr>
-            <w:r>
-              <w:rPr>
-                <w:sz w:val="17"/>
-              </w:rPr>
-              <w:t>TECH</w:t>
-            </w:r>
-          </w:p>
-          <w:p>
-            <w:r>
-              <w:rPr>
-                <w:sz w:val="17"/>
-              </w:rPr>
-              <w:t>12. Постпродакшн: түсті түзету, VFX, титрлер, өңдеу</w:t>
-            </w:r>
-          </w:p>
-        </w:tc>
-        <w:tc>
-          <w:tcPr>
-            <w:tcW w:w="1020" w:type="dxa"/>
-          </w:tcPr>
-          <w:p>
-            <w:pPr>
-              <w:jc w:val="center"/>
-            </w:pPr>
-            <w:r>
-              <w:rPr>
-                <w:sz w:val="17"/>
-              </w:rPr>
-              <w:t>/6</w:t>
-            </w:r>
-          </w:p>
-        </w:tc>
-        <w:tc>
-          <w:tcPr>
-            <w:tcW w:w="5783" w:type="dxa"/>
-          </w:tcPr>
-          <w:p>
-            <w:r>
-              <w:rPr>
-                <w:sz w:val="17"/>
-              </w:rPr>
-              <w:t>0–2 — постпродакшн әлсіз немесе ұқыпсыз; байқалатын техникалық қателер бар</w:t>
-            </w:r>
-          </w:p>
-          <w:p>
-            <w:r>
-              <w:rPr>
-                <w:sz w:val="17"/>
-              </w:rPr>
-              <w:t>3–4 — өңдеу қабылдауға болады, бірақ әрдайым ұқыпты немесе стилистикалық тұрғыдан біртұтас емес</w:t>
-            </w:r>
-          </w:p>
-          <w:p>
-            <w:r>
-              <w:rPr>
-                <w:sz w:val="17"/>
-              </w:rPr>
-              <w:t>5–6 — финалдық өңдеу ұқыпты, кәсіби көрінеді және фильмді күшейтеді</w:t>
-            </w:r>
-          </w:p>
-        </w:tc>
-      </w:tr>
-      <w:tr>
-        <w:trPr>
-          <w:cantSplit/>
-          <w:jc w:val="center"/>
-        </w:trPr>
-        <w:tc>
-          <w:tcPr>
-            <w:tcW w:w="2835" w:type="dxa"/>
-          </w:tcPr>
-          <w:p>
-            <w:pPr>
-              <w:jc w:val="center"/>
-            </w:pPr>
-            <w:r>
-              <w:rPr>
-                <w:sz w:val="17"/>
-              </w:rPr>
-              <w:t>GENERAL</w:t>
-            </w:r>
-          </w:p>
-          <w:p>
-            <w:r>
-              <w:rPr>
-                <w:sz w:val="17"/>
-              </w:rPr>
-              <w:t>13. Режиссура және айтылымның тұтастығы</w:t>
-            </w:r>
-          </w:p>
-        </w:tc>
-        <w:tc>
-          <w:tcPr>
-            <w:tcW w:w="1020" w:type="dxa"/>
-          </w:tcPr>
-          <w:p>
-            <w:pPr>
-              <w:jc w:val="center"/>
-            </w:pPr>
-            <w:r>
-              <w:rPr>
-                <w:sz w:val="17"/>
-              </w:rPr>
-              <w:t>/10</w:t>
-            </w:r>
-          </w:p>
-        </w:tc>
-        <w:tc>
-          <w:tcPr>
-            <w:tcW w:w="5783" w:type="dxa"/>
+            <w:tcW w:w="5845" w:type="dxa"/>
           </w:tcPr>
           <w:p>
             <w:r>
@@ -2718,6 +3816,7 @@
         <w:jc w:val="right"/>
       </w:pPr>
       <w:r>
+        <w:lastRenderedPageBreak/>
         <w:t>№ 2 қосымша</w:t>
       </w:r>
     </w:p>
@@ -2751,7 +3850,7 @@
     </w:p>
     <w:p>
       <w:pPr>
-        <w:pStyle w:val="Heading1"/>
+        <w:pStyle w:val="1"/>
         <w:keepNext/>
       </w:pPr>
       <w:r>
@@ -2786,7 +3885,6 @@
         <w:gridCol w:w="1947"/>
         <w:gridCol w:w="1946"/>
         <w:gridCol w:w="1946"/>
-        <w:gridCol w:w="1946"/>
       </w:tblGrid>
       <w:tr>
         <w:trPr>
@@ -2794,7 +3892,7 @@
         </w:trPr>
         <w:tc>
           <w:tcPr>
-            <w:tcW w:w="1950" w:type="dxa"/>
+            <w:tcW w:w="1947" w:type="dxa"/>
             <w:shd w:val="clear" w:color="auto" w:fill="F2F2F2"/>
             <w:vAlign w:val="center"/>
           </w:tcPr>
@@ -2808,7 +3906,7 @@
         </w:tc>
         <w:tc>
           <w:tcPr>
-            <w:tcW w:w="1950" w:type="dxa"/>
+            <w:tcW w:w="1947" w:type="dxa"/>
             <w:shd w:val="clear" w:color="auto" w:fill="F2F2F2"/>
             <w:vAlign w:val="center"/>
           </w:tcPr>
@@ -2829,7 +3927,7 @@
         </w:tc>
         <w:tc>
           <w:tcPr>
-            <w:tcW w:w="1950" w:type="dxa"/>
+            <w:tcW w:w="1946" w:type="dxa"/>
             <w:shd w:val="clear" w:color="auto" w:fill="F2F2F2"/>
             <w:vAlign w:val="center"/>
           </w:tcPr>
@@ -2850,7 +3948,7 @@
         </w:tc>
         <w:tc>
           <w:tcPr>
-            <w:tcW w:w="1950" w:type="dxa"/>
+            <w:tcW w:w="1946" w:type="dxa"/>
             <w:shd w:val="clear" w:color="auto" w:fill="F2F2F2"/>
             <w:vAlign w:val="center"/>
           </w:tcPr>
@@ -2865,29 +3963,17 @@
                 <w:b/>
                 <w:sz w:val="24"/>
               </w:rPr>
-              <w:t>Visual award</w:t>
-            </w:r>
-          </w:p>
-        </w:tc>
-        <w:tc>
-          <w:tcPr>
-            <w:tcW w:w="1950" w:type="dxa"/>
-            <w:shd w:val="clear" w:color="auto" w:fill="F2F2F2"/>
-            <w:vAlign w:val="center"/>
-          </w:tcPr>
-          <w:p>
-            <w:pPr>
-              <w:spacing w:line="240" w:lineRule="auto"/>
-              <w:ind w:firstLine="0"/>
-              <w:jc w:val="center"/>
-            </w:pPr>
+              <w:t xml:space="preserve">Tech </w:t>
+            </w:r>
+            <w:proofErr w:type="spellStart"/>
             <w:r>
               <w:rPr>
                 <w:b/>
                 <w:sz w:val="24"/>
               </w:rPr>
-              <w:t>Tech award</w:t>
-            </w:r>
+              <w:t>award</w:t>
+            </w:r>
+            <w:proofErr w:type="spellEnd"/>
           </w:p>
         </w:tc>
       </w:tr>
@@ -2897,7 +3983,7 @@
         </w:trPr>
         <w:tc>
           <w:tcPr>
-            <w:tcW w:w="1950" w:type="dxa"/>
+            <w:tcW w:w="1947" w:type="dxa"/>
             <w:shd w:val="clear" w:color="auto" w:fill="F2F2F2"/>
             <w:vAlign w:val="center"/>
           </w:tcPr>
@@ -2907,18 +3993,36 @@
               <w:ind w:firstLine="0"/>
               <w:jc w:val="center"/>
             </w:pPr>
+            <w:proofErr w:type="spellStart"/>
             <w:r>
               <w:rPr>
                 <w:b/>
                 <w:sz w:val="24"/>
               </w:rPr>
-              <w:t>Бірінші таңдау</w:t>
-            </w:r>
+              <w:t>Бірінші</w:t>
+            </w:r>
+            <w:proofErr w:type="spellEnd"/>
+            <w:r>
+              <w:rPr>
+                <w:b/>
+                <w:sz w:val="24"/>
+              </w:rPr>
+              <w:t xml:space="preserve"> </w:t>
+            </w:r>
+            <w:proofErr w:type="spellStart"/>
+            <w:r>
+              <w:rPr>
+                <w:b/>
+                <w:sz w:val="24"/>
+              </w:rPr>
+              <w:t>таңдау</w:t>
+            </w:r>
+            <w:proofErr w:type="spellEnd"/>
           </w:p>
         </w:tc>
         <w:tc>
           <w:tcPr>
-            <w:tcW w:w="1950" w:type="dxa"/>
+            <w:tcW w:w="1947" w:type="dxa"/>
             <w:vAlign w:val="center"/>
           </w:tcPr>
           <w:p>
@@ -2931,7 +4035,7 @@
         </w:tc>
         <w:tc>
           <w:tcPr>
-            <w:tcW w:w="1950" w:type="dxa"/>
+            <w:tcW w:w="1946" w:type="dxa"/>
             <w:vAlign w:val="center"/>
           </w:tcPr>
           <w:p>
@@ -2944,20 +4048,7 @@
         </w:tc>
         <w:tc>
           <w:tcPr>
-            <w:tcW w:w="1950" w:type="dxa"/>
-            <w:vAlign w:val="center"/>
-          </w:tcPr>
-          <w:p>
-            <w:pPr>
-              <w:spacing w:line="240" w:lineRule="auto"/>
-              <w:ind w:firstLine="0"/>
-              <w:jc w:val="center"/>
-            </w:pPr>
-          </w:p>
-        </w:tc>
-        <w:tc>
-          <w:tcPr>
-            <w:tcW w:w="1950" w:type="dxa"/>
+            <w:tcW w:w="1946" w:type="dxa"/>
             <w:vAlign w:val="center"/>
           </w:tcPr>
           <w:p>
@@ -2975,7 +4066,7 @@
         </w:trPr>
         <w:tc>
           <w:tcPr>
-            <w:tcW w:w="1950" w:type="dxa"/>
+            <w:tcW w:w="1947" w:type="dxa"/>
             <w:shd w:val="clear" w:color="auto" w:fill="F2F2F2"/>
             <w:vAlign w:val="center"/>
           </w:tcPr>
@@ -2996,7 +4087,7 @@
         </w:tc>
         <w:tc>
           <w:tcPr>
-            <w:tcW w:w="1950" w:type="dxa"/>
+            <w:tcW w:w="1947" w:type="dxa"/>
             <w:vAlign w:val="center"/>
           </w:tcPr>
           <w:p>
@@ -3009,7 +4100,7 @@
         </w:tc>
         <w:tc>
           <w:tcPr>
-            <w:tcW w:w="1950" w:type="dxa"/>
+            <w:tcW w:w="1946" w:type="dxa"/>
             <w:vAlign w:val="center"/>
           </w:tcPr>
           <w:p>
@@ -3022,7 +4113,7 @@
         </w:tc>
         <w:tc>
           <w:tcPr>
-            <w:tcW w:w="1950" w:type="dxa"/>
+            <w:tcW w:w="1946" w:type="dxa"/>
             <w:vAlign w:val="center"/>
           </w:tcPr>
           <w:p>
@@ -3033,19 +4124,6 @@
             </w:pPr>
           </w:p>
         </w:tc>
-        <w:tc>
-          <w:tcPr>
-            <w:tcW w:w="1950" w:type="dxa"/>
-            <w:vAlign w:val="center"/>
-          </w:tcPr>
-          <w:p>
-            <w:pPr>
-              <w:spacing w:line="240" w:lineRule="auto"/>
-              <w:ind w:firstLine="0"/>
-              <w:jc w:val="center"/>
-            </w:pPr>
-          </w:p>
-        </w:tc>
       </w:tr>
     </w:tbl>
     <w:p>
@@ -3062,13 +4140,6 @@
       <w:r>
         <w:t>Impact award — мазмұнымен терең әсер қалдырған екі фильмді таңдаңыз.</w:t>
       </w:r>
-      <w:r/>
-      <w:r/>
-    </w:p>
-    <w:p>
-      <w:r>
-        <w:t>Visual award — ең әдемі екі фильмді таңдаңыз.</w:t>
-      </w:r>
     </w:p>
     <w:p>
       <w:r>
@@ -3120,7 +4191,7 @@
     </w:p>
     <w:p>
       <w:pPr>
-        <w:pStyle w:val="Heading1"/>
+        <w:pStyle w:val="1"/>
         <w:keepNext/>
       </w:pPr>
       <w:r>
@@ -3152,8 +4223,8 @@
       </w:tblPr>
       <w:tblGrid>
         <w:gridCol w:w="2433"/>
-        <w:gridCol w:w="2435"/>
-        <w:gridCol w:w="2430"/>
+        <w:gridCol w:w="2436"/>
+        <w:gridCol w:w="2429"/>
         <w:gridCol w:w="2434"/>
       </w:tblGrid>
       <w:tr>
@@ -3790,12 +4861,12 @@
       </w:r>
     </w:p>
     <w:sectPr>
-      <w:footerReference w:type="default" r:id="rId8"/>
-      <w:headerReference w:type="default" r:id="rId11"/>
+      <w:headerReference w:type="even" r:id="rId8"/>
+      <w:headerReference w:type="default" r:id="rId9"/>
+      <w:footerReference w:type="even" r:id="rId10"/>
+      <w:footerReference w:type="default" r:id="rId11"/>
       <w:headerReference w:type="first" r:id="rId12"/>
-      <w:headerReference w:type="even" r:id="rId13"/>
-      <w:footerReference w:type="first" r:id="rId14"/>
-      <w:footerReference w:type="even" r:id="rId15"/>
+      <w:footerReference w:type="first" r:id="rId13"/>
       <w:pgSz w:w="11906" w:h="16838"/>
       <w:pgMar w:top="1440" w:right="1077" w:bottom="1440" w:left="1077" w:header="709" w:footer="709" w:gutter="0"/>
       <w:pgNumType w:start="1"/>
@@ -3806,7 +4877,7 @@
 </file>
 
 <file path=word/endnotes.xml><?xml version="1.0" encoding="utf-8"?>
-<w:endnotes xmlns:wpc="http://schemas.microsoft.com/office/word/2010/wordprocessingCanvas" xmlns:cx="http://schemas.microsoft.com/office/drawing/2014/chartex" xmlns:cx1="http://schemas.microsoft.com/office/drawing/2015/9/8/chartex" xmlns:cx2="http://schemas.microsoft.com/office/drawing/2015/10/21/chartex" xmlns:cx3="http://schemas.microsoft.com/office/drawing/2016/5/9/chartex" xmlns:cx4="http://schemas.microsoft.com/office/drawing/2016/5/10/chartex" xmlns:cx5="http://schemas.microsoft.com/office/drawing/2016/5/11/chartex" xmlns:cx6="http://schemas.microsoft.com/office/drawing/2016/5/12/chartex" xmlns:cx7="http://schemas.microsoft.com/office/drawing/2016/5/13/chartex" xmlns:cx8="http://schemas.microsoft.com/office/drawing/2016/5/14/chartex" xmlns:mc="http://schemas.openxmlformats.org/markup-compatibility/2006" xmlns:aink="http://schemas.microsoft.com/office/drawing/2016/ink" xmlns:am3d="http://schemas.microsoft.com/office/drawing/2017/model3d" xmlns:o="urn:schemas-microsoft-com:office:office" xmlns:oel="http://schemas.microsoft.com/office/2019/extlst" xmlns:r="http://schemas.openxmlformats.org/officeDocument/2006/relationships" xmlns:m="http://schemas.openxmlformats.org/officeDocument/2006/math" xmlns:v="urn:schemas-microsoft-com:vml" xmlns:wp14="http://schemas.microsoft.com/office/word/2010/wordprocessingDrawing" xmlns:wp="http://schemas.openxmlformats.org/drawingml/2006/wordprocessingDrawing" xmlns:w10="urn:schemas-microsoft-com:office:word" xmlns:w="http://schemas.openxmlformats.org/wordprocessingml/2006/main" xmlns:w14="http://schemas.microsoft.com/office/word/2010/wordml" xmlns:w15="http://schemas.microsoft.com/office/word/2012/wordml" xmlns:w16cex="http://schemas.microsoft.com/office/word/2018/wordml/cex" xmlns:w16cid="http://schemas.microsoft.com/office/word/2016/wordml/cid" xmlns:w16="http://schemas.microsoft.com/office/word/2018/wordml" xmlns:w16du="http://schemas.microsoft.com/office/word/2023/wordml/word16du" xmlns:w16sdtdh="http://schemas.microsoft.com/office/word/2020/wordml/sdtdatahash" xmlns:w16sdtfl="http://schemas.microsoft.com/office/word/2024/wordml/sdtformatlock" xmlns:w16se="http://schemas.microsoft.com/office/word/2015/wordml/symex" xmlns:wpg="http://schemas.microsoft.com/office/word/2010/wordprocessingGroup" xmlns:wpi="http://schemas.microsoft.com/office/word/2010/wordprocessingInk" xmlns:wne="http://schemas.microsoft.com/office/word/2006/wordml" xmlns:wps="http://schemas.microsoft.com/office/word/2010/wordprocessingShape" mc:Ignorable="w14 w15 w16se w16cid w16 w16cex w16sdtdh w16sdtfl w16du wp14">
+<w:endnotes xmlns:wpc="http://schemas.microsoft.com/office/word/2010/wordprocessingCanvas" xmlns:cx="http://schemas.microsoft.com/office/drawing/2014/chartex" xmlns:cx1="http://schemas.microsoft.com/office/drawing/2015/9/8/chartex" xmlns:cx2="http://schemas.microsoft.com/office/drawing/2015/10/21/chartex" xmlns:cx3="http://schemas.microsoft.com/office/drawing/2016/5/9/chartex" xmlns:cx4="http://schemas.microsoft.com/office/drawing/2016/5/10/chartex" xmlns:cx5="http://schemas.microsoft.com/office/drawing/2016/5/11/chartex" xmlns:cx6="http://schemas.microsoft.com/office/drawing/2016/5/12/chartex" xmlns:cx7="http://schemas.microsoft.com/office/drawing/2016/5/13/chartex" xmlns:cx8="http://schemas.microsoft.com/office/drawing/2016/5/14/chartex" xmlns:mc="http://schemas.openxmlformats.org/markup-compatibility/2006" xmlns:aink="http://schemas.microsoft.com/office/drawing/2016/ink" xmlns:am3d="http://schemas.microsoft.com/office/drawing/2017/model3d" xmlns:o="urn:schemas-microsoft-com:office:office" xmlns:r="http://schemas.openxmlformats.org/officeDocument/2006/relationships" xmlns:m="http://schemas.openxmlformats.org/officeDocument/2006/math" xmlns:v="urn:schemas-microsoft-com:vml" xmlns:wp14="http://schemas.microsoft.com/office/word/2010/wordprocessingDrawing" xmlns:wp="http://schemas.openxmlformats.org/drawingml/2006/wordprocessingDrawing" xmlns:w10="urn:schemas-microsoft-com:office:word" xmlns:w="http://schemas.openxmlformats.org/wordprocessingml/2006/main" xmlns:w14="http://schemas.microsoft.com/office/word/2010/wordml" xmlns:w15="http://schemas.microsoft.com/office/word/2012/wordml" xmlns:w16cex="http://schemas.microsoft.com/office/word/2018/wordml/cex" xmlns:w16cid="http://schemas.microsoft.com/office/word/2016/wordml/cid" xmlns:w16="http://schemas.microsoft.com/office/word/2018/wordml" xmlns:w16sdtdh="http://schemas.microsoft.com/office/word/2020/wordml/sdtdatahash" xmlns:w16se="http://schemas.microsoft.com/office/word/2015/wordml/symex" xmlns:wpg="http://schemas.microsoft.com/office/word/2010/wordprocessingGroup" xmlns:wpi="http://schemas.microsoft.com/office/word/2010/wordprocessingInk" xmlns:wne="http://schemas.microsoft.com/office/word/2006/wordml" xmlns:wps="http://schemas.microsoft.com/office/word/2010/wordprocessingShape" mc:Ignorable="w14 w15 w16se w16cid w16 w16cex w16sdtdh wp14">
   <w:endnote w:type="separator" w:id="-1">
     <w:p>
       <w:pPr>
@@ -3831,10 +4902,20 @@
 </file>
 
 <file path=word/footer1.xml><?xml version="1.0" encoding="utf-8"?>
-<w:ftr xmlns:wpc="http://schemas.microsoft.com/office/word/2010/wordprocessingCanvas" xmlns:cx="http://schemas.microsoft.com/office/drawing/2014/chartex" xmlns:cx1="http://schemas.microsoft.com/office/drawing/2015/9/8/chartex" xmlns:cx2="http://schemas.microsoft.com/office/drawing/2015/10/21/chartex" xmlns:cx3="http://schemas.microsoft.com/office/drawing/2016/5/9/chartex" xmlns:cx4="http://schemas.microsoft.com/office/drawing/2016/5/10/chartex" xmlns:cx5="http://schemas.microsoft.com/office/drawing/2016/5/11/chartex" xmlns:cx6="http://schemas.microsoft.com/office/drawing/2016/5/12/chartex" xmlns:cx7="http://schemas.microsoft.com/office/drawing/2016/5/13/chartex" xmlns:cx8="http://schemas.microsoft.com/office/drawing/2016/5/14/chartex" xmlns:mc="http://schemas.openxmlformats.org/markup-compatibility/2006" xmlns:aink="http://schemas.microsoft.com/office/drawing/2016/ink" xmlns:am3d="http://schemas.microsoft.com/office/drawing/2017/model3d" xmlns:o="urn:schemas-microsoft-com:office:office" xmlns:oel="http://schemas.microsoft.com/office/2019/extlst" xmlns:r="http://schemas.openxmlformats.org/officeDocument/2006/relationships" xmlns:m="http://schemas.openxmlformats.org/officeDocument/2006/math" xmlns:v="urn:schemas-microsoft-com:vml" xmlns:wp14="http://schemas.microsoft.com/office/word/2010/wordprocessingDrawing" xmlns:wp="http://schemas.openxmlformats.org/drawingml/2006/wordprocessingDrawing" xmlns:w10="urn:schemas-microsoft-com:office:word" xmlns:w="http://schemas.openxmlformats.org/wordprocessingml/2006/main" xmlns:w14="http://schemas.microsoft.com/office/word/2010/wordml" xmlns:w15="http://schemas.microsoft.com/office/word/2012/wordml" xmlns:w16cex="http://schemas.microsoft.com/office/word/2018/wordml/cex" xmlns:w16cid="http://schemas.microsoft.com/office/word/2016/wordml/cid" xmlns:w16="http://schemas.microsoft.com/office/word/2018/wordml" xmlns:w16du="http://schemas.microsoft.com/office/word/2023/wordml/word16du" xmlns:w16sdtdh="http://schemas.microsoft.com/office/word/2020/wordml/sdtdatahash" xmlns:w16sdtfl="http://schemas.microsoft.com/office/word/2024/wordml/sdtformatlock" xmlns:w16se="http://schemas.microsoft.com/office/word/2015/wordml/symex" xmlns:wpg="http://schemas.microsoft.com/office/word/2010/wordprocessingGroup" xmlns:wpi="http://schemas.microsoft.com/office/word/2010/wordprocessingInk" xmlns:wne="http://schemas.microsoft.com/office/word/2006/wordml" xmlns:wps="http://schemas.microsoft.com/office/word/2010/wordprocessingShape" mc:Ignorable="w14 w15 w16se w16cid w16 w16cex w16sdtdh w16sdtfl w16du wp14">
+<w:ftr xmlns:wpc="http://schemas.microsoft.com/office/word/2010/wordprocessingCanvas" xmlns:cx="http://schemas.microsoft.com/office/drawing/2014/chartex" xmlns:cx1="http://schemas.microsoft.com/office/drawing/2015/9/8/chartex" xmlns:cx2="http://schemas.microsoft.com/office/drawing/2015/10/21/chartex" xmlns:cx3="http://schemas.microsoft.com/office/drawing/2016/5/9/chartex" xmlns:cx4="http://schemas.microsoft.com/office/drawing/2016/5/10/chartex" xmlns:cx5="http://schemas.microsoft.com/office/drawing/2016/5/11/chartex" xmlns:cx6="http://schemas.microsoft.com/office/drawing/2016/5/12/chartex" xmlns:cx7="http://schemas.microsoft.com/office/drawing/2016/5/13/chartex" xmlns:cx8="http://schemas.microsoft.com/office/drawing/2016/5/14/chartex" xmlns:mc="http://schemas.openxmlformats.org/markup-compatibility/2006" xmlns:aink="http://schemas.microsoft.com/office/drawing/2016/ink" xmlns:am3d="http://schemas.microsoft.com/office/drawing/2017/model3d" xmlns:o="urn:schemas-microsoft-com:office:office" xmlns:r="http://schemas.openxmlformats.org/officeDocument/2006/relationships" xmlns:m="http://schemas.openxmlformats.org/officeDocument/2006/math" xmlns:v="urn:schemas-microsoft-com:vml" xmlns:wp14="http://schemas.microsoft.com/office/word/2010/wordprocessingDrawing" xmlns:wp="http://schemas.openxmlformats.org/drawingml/2006/wordprocessingDrawing" xmlns:w10="urn:schemas-microsoft-com:office:word" xmlns:w="http://schemas.openxmlformats.org/wordprocessingml/2006/main" xmlns:w14="http://schemas.microsoft.com/office/word/2010/wordml" xmlns:w15="http://schemas.microsoft.com/office/word/2012/wordml" xmlns:w16cex="http://schemas.microsoft.com/office/word/2018/wordml/cex" xmlns:w16cid="http://schemas.microsoft.com/office/word/2016/wordml/cid" xmlns:w16="http://schemas.microsoft.com/office/word/2018/wordml" xmlns:w16sdtdh="http://schemas.microsoft.com/office/word/2020/wordml/sdtdatahash" xmlns:w16se="http://schemas.microsoft.com/office/word/2015/wordml/symex" xmlns:wpg="http://schemas.microsoft.com/office/word/2010/wordprocessingGroup" xmlns:wpi="http://schemas.microsoft.com/office/word/2010/wordprocessingInk" xmlns:wne="http://schemas.microsoft.com/office/word/2006/wordml" xmlns:wps="http://schemas.microsoft.com/office/word/2010/wordprocessingShape" mc:Ignorable="w14 w15 w16se w16cid w16 w16cex w16sdtdh wp14">
   <w:p>
     <w:pPr>
-      <w:pStyle w:val="Footer"/>
+      <w:pStyle w:val="a8"/>
+    </w:pPr>
+  </w:p>
+</w:ftr>
+</file>
+
+<file path=word/footer2.xml><?xml version="1.0" encoding="utf-8"?>
+<w:ftr xmlns:wpc="http://schemas.microsoft.com/office/word/2010/wordprocessingCanvas" xmlns:cx="http://schemas.microsoft.com/office/drawing/2014/chartex" xmlns:cx1="http://schemas.microsoft.com/office/drawing/2015/9/8/chartex" xmlns:cx2="http://schemas.microsoft.com/office/drawing/2015/10/21/chartex" xmlns:cx3="http://schemas.microsoft.com/office/drawing/2016/5/9/chartex" xmlns:cx4="http://schemas.microsoft.com/office/drawing/2016/5/10/chartex" xmlns:cx5="http://schemas.microsoft.com/office/drawing/2016/5/11/chartex" xmlns:cx6="http://schemas.microsoft.com/office/drawing/2016/5/12/chartex" xmlns:cx7="http://schemas.microsoft.com/office/drawing/2016/5/13/chartex" xmlns:cx8="http://schemas.microsoft.com/office/drawing/2016/5/14/chartex" xmlns:mc="http://schemas.openxmlformats.org/markup-compatibility/2006" xmlns:aink="http://schemas.microsoft.com/office/drawing/2016/ink" xmlns:am3d="http://schemas.microsoft.com/office/drawing/2017/model3d" xmlns:o="urn:schemas-microsoft-com:office:office" xmlns:r="http://schemas.openxmlformats.org/officeDocument/2006/relationships" xmlns:m="http://schemas.openxmlformats.org/officeDocument/2006/math" xmlns:v="urn:schemas-microsoft-com:vml" xmlns:wp14="http://schemas.microsoft.com/office/word/2010/wordprocessingDrawing" xmlns:wp="http://schemas.openxmlformats.org/drawingml/2006/wordprocessingDrawing" xmlns:w10="urn:schemas-microsoft-com:office:word" xmlns:w="http://schemas.openxmlformats.org/wordprocessingml/2006/main" xmlns:w14="http://schemas.microsoft.com/office/word/2010/wordml" xmlns:w15="http://schemas.microsoft.com/office/word/2012/wordml" xmlns:w16cex="http://schemas.microsoft.com/office/word/2018/wordml/cex" xmlns:w16cid="http://schemas.microsoft.com/office/word/2016/wordml/cid" xmlns:w16="http://schemas.microsoft.com/office/word/2018/wordml" xmlns:w16sdtdh="http://schemas.microsoft.com/office/word/2020/wordml/sdtdatahash" xmlns:w16se="http://schemas.microsoft.com/office/word/2015/wordml/symex" xmlns:wpg="http://schemas.microsoft.com/office/word/2010/wordprocessingGroup" xmlns:wpi="http://schemas.microsoft.com/office/word/2010/wordprocessingInk" xmlns:wne="http://schemas.microsoft.com/office/word/2006/wordml" xmlns:wps="http://schemas.microsoft.com/office/word/2010/wordprocessingShape" mc:Ignorable="w14 w15 w16se w16cid w16 w16cex w16sdtdh wp14">
+  <w:p>
+    <w:pPr>
+      <w:pStyle w:val="a8"/>
       <w:ind w:firstLine="0"/>
       <w:jc w:val="center"/>
       <w:rPr>
@@ -3855,28 +4936,18 @@
 </w:ftr>
 </file>
 
-<file path=word/footer2.xml><?xml version="1.0" encoding="utf-8"?>
-<w:ftr xmlns:m="http://schemas.openxmlformats.org/officeDocument/2006/math" xmlns:mc="http://schemas.openxmlformats.org/markup-compatibility/2006" xmlns:mo="http://schemas.microsoft.com/office/mac/office/2008/main" xmlns:mv="urn:schemas-microsoft-com:mac:vml" xmlns:o="urn:schemas-microsoft-com:office:office" xmlns:r="http://schemas.openxmlformats.org/officeDocument/2006/relationships" xmlns:v="urn:schemas-microsoft-com:vml" xmlns:w10="urn:schemas-microsoft-com:office:word" xmlns:w14="http://schemas.microsoft.com/office/word/2010/wordml" xmlns:w="http://schemas.openxmlformats.org/wordprocessingml/2006/main" xmlns:wne="http://schemas.microsoft.com/office/word/2006/wordml" xmlns:wp14="http://schemas.microsoft.com/office/word/2010/wordprocessingDrawing" xmlns:wp="http://schemas.openxmlformats.org/drawingml/2006/wordprocessingDrawing" xmlns:wpc="http://schemas.microsoft.com/office/word/2010/wordprocessingCanvas" xmlns:wpg="http://schemas.microsoft.com/office/word/2010/wordprocessingGroup" xmlns:wpi="http://schemas.microsoft.com/office/word/2010/wordprocessingInk" xmlns:wps="http://schemas.microsoft.com/office/word/2010/wordprocessingShape" mc:Ignorable="w14 wp14">
+<file path=word/footer3.xml><?xml version="1.0" encoding="utf-8"?>
+<w:ftr xmlns:wpc="http://schemas.microsoft.com/office/word/2010/wordprocessingCanvas" xmlns:cx="http://schemas.microsoft.com/office/drawing/2014/chartex" xmlns:cx1="http://schemas.microsoft.com/office/drawing/2015/9/8/chartex" xmlns:cx2="http://schemas.microsoft.com/office/drawing/2015/10/21/chartex" xmlns:cx3="http://schemas.microsoft.com/office/drawing/2016/5/9/chartex" xmlns:cx4="http://schemas.microsoft.com/office/drawing/2016/5/10/chartex" xmlns:cx5="http://schemas.microsoft.com/office/drawing/2016/5/11/chartex" xmlns:cx6="http://schemas.microsoft.com/office/drawing/2016/5/12/chartex" xmlns:cx7="http://schemas.microsoft.com/office/drawing/2016/5/13/chartex" xmlns:cx8="http://schemas.microsoft.com/office/drawing/2016/5/14/chartex" xmlns:mc="http://schemas.openxmlformats.org/markup-compatibility/2006" xmlns:aink="http://schemas.microsoft.com/office/drawing/2016/ink" xmlns:am3d="http://schemas.microsoft.com/office/drawing/2017/model3d" xmlns:o="urn:schemas-microsoft-com:office:office" xmlns:r="http://schemas.openxmlformats.org/officeDocument/2006/relationships" xmlns:m="http://schemas.openxmlformats.org/officeDocument/2006/math" xmlns:v="urn:schemas-microsoft-com:vml" xmlns:wp14="http://schemas.microsoft.com/office/word/2010/wordprocessingDrawing" xmlns:wp="http://schemas.openxmlformats.org/drawingml/2006/wordprocessingDrawing" xmlns:w10="urn:schemas-microsoft-com:office:word" xmlns:w="http://schemas.openxmlformats.org/wordprocessingml/2006/main" xmlns:w14="http://schemas.microsoft.com/office/word/2010/wordml" xmlns:w15="http://schemas.microsoft.com/office/word/2012/wordml" xmlns:w16cex="http://schemas.microsoft.com/office/word/2018/wordml/cex" xmlns:w16cid="http://schemas.microsoft.com/office/word/2016/wordml/cid" xmlns:w16="http://schemas.microsoft.com/office/word/2018/wordml" xmlns:w16sdtdh="http://schemas.microsoft.com/office/word/2020/wordml/sdtdatahash" xmlns:w16se="http://schemas.microsoft.com/office/word/2015/wordml/symex" xmlns:wpg="http://schemas.microsoft.com/office/word/2010/wordprocessingGroup" xmlns:wpi="http://schemas.microsoft.com/office/word/2010/wordprocessingInk" xmlns:wne="http://schemas.microsoft.com/office/word/2006/wordml" xmlns:wps="http://schemas.microsoft.com/office/word/2010/wordprocessingShape" mc:Ignorable="w14 w15 w16se w16cid w16 w16cex w16sdtdh wp14">
   <w:p>
     <w:pPr>
-      <w:pStyle w:val="Footer"/>
-    </w:pPr>
-  </w:p>
-</w:ftr>
-</file>
-
-<file path=word/footer3.xml><?xml version="1.0" encoding="utf-8"?>
-<w:ftr xmlns:m="http://schemas.openxmlformats.org/officeDocument/2006/math" xmlns:mc="http://schemas.openxmlformats.org/markup-compatibility/2006" xmlns:mo="http://schemas.microsoft.com/office/mac/office/2008/main" xmlns:mv="urn:schemas-microsoft-com:mac:vml" xmlns:o="urn:schemas-microsoft-com:office:office" xmlns:r="http://schemas.openxmlformats.org/officeDocument/2006/relationships" xmlns:v="urn:schemas-microsoft-com:vml" xmlns:w10="urn:schemas-microsoft-com:office:word" xmlns:w14="http://schemas.microsoft.com/office/word/2010/wordml" xmlns:w="http://schemas.openxmlformats.org/wordprocessingml/2006/main" xmlns:wne="http://schemas.microsoft.com/office/word/2006/wordml" xmlns:wp14="http://schemas.microsoft.com/office/word/2010/wordprocessingDrawing" xmlns:wp="http://schemas.openxmlformats.org/drawingml/2006/wordprocessingDrawing" xmlns:wpc="http://schemas.microsoft.com/office/word/2010/wordprocessingCanvas" xmlns:wpg="http://schemas.microsoft.com/office/word/2010/wordprocessingGroup" xmlns:wpi="http://schemas.microsoft.com/office/word/2010/wordprocessingInk" xmlns:wps="http://schemas.microsoft.com/office/word/2010/wordprocessingShape" mc:Ignorable="w14 wp14">
-  <w:p>
-    <w:pPr>
-      <w:pStyle w:val="Footer"/>
+      <w:pStyle w:val="a8"/>
     </w:pPr>
   </w:p>
 </w:ftr>
 </file>
 
 <file path=word/footnotes.xml><?xml version="1.0" encoding="utf-8"?>
-<w:footnotes xmlns:wpc="http://schemas.microsoft.com/office/word/2010/wordprocessingCanvas" xmlns:cx="http://schemas.microsoft.com/office/drawing/2014/chartex" xmlns:cx1="http://schemas.microsoft.com/office/drawing/2015/9/8/chartex" xmlns:cx2="http://schemas.microsoft.com/office/drawing/2015/10/21/chartex" xmlns:cx3="http://schemas.microsoft.com/office/drawing/2016/5/9/chartex" xmlns:cx4="http://schemas.microsoft.com/office/drawing/2016/5/10/chartex" xmlns:cx5="http://schemas.microsoft.com/office/drawing/2016/5/11/chartex" xmlns:cx6="http://schemas.microsoft.com/office/drawing/2016/5/12/chartex" xmlns:cx7="http://schemas.microsoft.com/office/drawing/2016/5/13/chartex" xmlns:cx8="http://schemas.microsoft.com/office/drawing/2016/5/14/chartex" xmlns:mc="http://schemas.openxmlformats.org/markup-compatibility/2006" xmlns:aink="http://schemas.microsoft.com/office/drawing/2016/ink" xmlns:am3d="http://schemas.microsoft.com/office/drawing/2017/model3d" xmlns:o="urn:schemas-microsoft-com:office:office" xmlns:oel="http://schemas.microsoft.com/office/2019/extlst" xmlns:r="http://schemas.openxmlformats.org/officeDocument/2006/relationships" xmlns:m="http://schemas.openxmlformats.org/officeDocument/2006/math" xmlns:v="urn:schemas-microsoft-com:vml" xmlns:wp14="http://schemas.microsoft.com/office/word/2010/wordprocessingDrawing" xmlns:wp="http://schemas.openxmlformats.org/drawingml/2006/wordprocessingDrawing" xmlns:w10="urn:schemas-microsoft-com:office:word" xmlns:w="http://schemas.openxmlformats.org/wordprocessingml/2006/main" xmlns:w14="http://schemas.microsoft.com/office/word/2010/wordml" xmlns:w15="http://schemas.microsoft.com/office/word/2012/wordml" xmlns:w16cex="http://schemas.microsoft.com/office/word/2018/wordml/cex" xmlns:w16cid="http://schemas.microsoft.com/office/word/2016/wordml/cid" xmlns:w16="http://schemas.microsoft.com/office/word/2018/wordml" xmlns:w16du="http://schemas.microsoft.com/office/word/2023/wordml/word16du" xmlns:w16sdtdh="http://schemas.microsoft.com/office/word/2020/wordml/sdtdatahash" xmlns:w16sdtfl="http://schemas.microsoft.com/office/word/2024/wordml/sdtformatlock" xmlns:w16se="http://schemas.microsoft.com/office/word/2015/wordml/symex" xmlns:wpg="http://schemas.microsoft.com/office/word/2010/wordprocessingGroup" xmlns:wpi="http://schemas.microsoft.com/office/word/2010/wordprocessingInk" xmlns:wne="http://schemas.microsoft.com/office/word/2006/wordml" xmlns:wps="http://schemas.microsoft.com/office/word/2010/wordprocessingShape" mc:Ignorable="w14 w15 w16se w16cid w16 w16cex w16sdtdh w16sdtfl w16du wp14">
+<w:footnotes xmlns:wpc="http://schemas.microsoft.com/office/word/2010/wordprocessingCanvas" xmlns:cx="http://schemas.microsoft.com/office/drawing/2014/chartex" xmlns:cx1="http://schemas.microsoft.com/office/drawing/2015/9/8/chartex" xmlns:cx2="http://schemas.microsoft.com/office/drawing/2015/10/21/chartex" xmlns:cx3="http://schemas.microsoft.com/office/drawing/2016/5/9/chartex" xmlns:cx4="http://schemas.microsoft.com/office/drawing/2016/5/10/chartex" xmlns:cx5="http://schemas.microsoft.com/office/drawing/2016/5/11/chartex" xmlns:cx6="http://schemas.microsoft.com/office/drawing/2016/5/12/chartex" xmlns:cx7="http://schemas.microsoft.com/office/drawing/2016/5/13/chartex" xmlns:cx8="http://schemas.microsoft.com/office/drawing/2016/5/14/chartex" xmlns:mc="http://schemas.openxmlformats.org/markup-compatibility/2006" xmlns:aink="http://schemas.microsoft.com/office/drawing/2016/ink" xmlns:am3d="http://schemas.microsoft.com/office/drawing/2017/model3d" xmlns:o="urn:schemas-microsoft-com:office:office" xmlns:r="http://schemas.openxmlformats.org/officeDocument/2006/relationships" xmlns:m="http://schemas.openxmlformats.org/officeDocument/2006/math" xmlns:v="urn:schemas-microsoft-com:vml" xmlns:wp14="http://schemas.microsoft.com/office/word/2010/wordprocessingDrawing" xmlns:wp="http://schemas.openxmlformats.org/drawingml/2006/wordprocessingDrawing" xmlns:w10="urn:schemas-microsoft-com:office:word" xmlns:w="http://schemas.openxmlformats.org/wordprocessingml/2006/main" xmlns:w14="http://schemas.microsoft.com/office/word/2010/wordml" xmlns:w15="http://schemas.microsoft.com/office/word/2012/wordml" xmlns:w16cex="http://schemas.microsoft.com/office/word/2018/wordml/cex" xmlns:w16cid="http://schemas.microsoft.com/office/word/2016/wordml/cid" xmlns:w16="http://schemas.microsoft.com/office/word/2018/wordml" xmlns:w16sdtdh="http://schemas.microsoft.com/office/word/2020/wordml/sdtdatahash" xmlns:w16se="http://schemas.microsoft.com/office/word/2015/wordml/symex" xmlns:wpg="http://schemas.microsoft.com/office/word/2010/wordprocessingGroup" xmlns:wpi="http://schemas.microsoft.com/office/word/2010/wordprocessingInk" xmlns:wne="http://schemas.microsoft.com/office/word/2006/wordml" xmlns:wps="http://schemas.microsoft.com/office/word/2010/wordprocessingShape" mc:Ignorable="w14 w15 w16se w16cid w16 w16cex w16sdtdh wp14">
   <w:footnote w:type="separator" w:id="-1">
     <w:p>
       <w:pPr>
@@ -3901,37 +4972,37 @@
 </file>
 
 <file path=word/header1.xml><?xml version="1.0" encoding="utf-8"?>
-<w:hdr xmlns:m="http://schemas.openxmlformats.org/officeDocument/2006/math" xmlns:mc="http://schemas.openxmlformats.org/markup-compatibility/2006" xmlns:mo="http://schemas.microsoft.com/office/mac/office/2008/main" xmlns:mv="urn:schemas-microsoft-com:mac:vml" xmlns:o="urn:schemas-microsoft-com:office:office" xmlns:r="http://schemas.openxmlformats.org/officeDocument/2006/relationships" xmlns:v="urn:schemas-microsoft-com:vml" xmlns:w10="urn:schemas-microsoft-com:office:word" xmlns:w14="http://schemas.microsoft.com/office/word/2010/wordml" xmlns:w="http://schemas.openxmlformats.org/wordprocessingml/2006/main" xmlns:wne="http://schemas.microsoft.com/office/word/2006/wordml" xmlns:wp14="http://schemas.microsoft.com/office/word/2010/wordprocessingDrawing" xmlns:wp="http://schemas.openxmlformats.org/drawingml/2006/wordprocessingDrawing" xmlns:wpc="http://schemas.microsoft.com/office/word/2010/wordprocessingCanvas" xmlns:wpg="http://schemas.microsoft.com/office/word/2010/wordprocessingGroup" xmlns:wpi="http://schemas.microsoft.com/office/word/2010/wordprocessingInk" xmlns:wps="http://schemas.microsoft.com/office/word/2010/wordprocessingShape" mc:Ignorable="w14 wp14">
+<w:hdr xmlns:wpc="http://schemas.microsoft.com/office/word/2010/wordprocessingCanvas" xmlns:cx="http://schemas.microsoft.com/office/drawing/2014/chartex" xmlns:cx1="http://schemas.microsoft.com/office/drawing/2015/9/8/chartex" xmlns:cx2="http://schemas.microsoft.com/office/drawing/2015/10/21/chartex" xmlns:cx3="http://schemas.microsoft.com/office/drawing/2016/5/9/chartex" xmlns:cx4="http://schemas.microsoft.com/office/drawing/2016/5/10/chartex" xmlns:cx5="http://schemas.microsoft.com/office/drawing/2016/5/11/chartex" xmlns:cx6="http://schemas.microsoft.com/office/drawing/2016/5/12/chartex" xmlns:cx7="http://schemas.microsoft.com/office/drawing/2016/5/13/chartex" xmlns:cx8="http://schemas.microsoft.com/office/drawing/2016/5/14/chartex" xmlns:mc="http://schemas.openxmlformats.org/markup-compatibility/2006" xmlns:aink="http://schemas.microsoft.com/office/drawing/2016/ink" xmlns:am3d="http://schemas.microsoft.com/office/drawing/2017/model3d" xmlns:o="urn:schemas-microsoft-com:office:office" xmlns:r="http://schemas.openxmlformats.org/officeDocument/2006/relationships" xmlns:m="http://schemas.openxmlformats.org/officeDocument/2006/math" xmlns:v="urn:schemas-microsoft-com:vml" xmlns:wp14="http://schemas.microsoft.com/office/word/2010/wordprocessingDrawing" xmlns:wp="http://schemas.openxmlformats.org/drawingml/2006/wordprocessingDrawing" xmlns:w10="urn:schemas-microsoft-com:office:word" xmlns:w="http://schemas.openxmlformats.org/wordprocessingml/2006/main" xmlns:w14="http://schemas.microsoft.com/office/word/2010/wordml" xmlns:w15="http://schemas.microsoft.com/office/word/2012/wordml" xmlns:w16cex="http://schemas.microsoft.com/office/word/2018/wordml/cex" xmlns:w16cid="http://schemas.microsoft.com/office/word/2016/wordml/cid" xmlns:w16="http://schemas.microsoft.com/office/word/2018/wordml" xmlns:w16sdtdh="http://schemas.microsoft.com/office/word/2020/wordml/sdtdatahash" xmlns:w16se="http://schemas.microsoft.com/office/word/2015/wordml/symex" xmlns:wpg="http://schemas.microsoft.com/office/word/2010/wordprocessingGroup" xmlns:wpi="http://schemas.microsoft.com/office/word/2010/wordprocessingInk" xmlns:wne="http://schemas.microsoft.com/office/word/2006/wordml" xmlns:wps="http://schemas.microsoft.com/office/word/2010/wordprocessingShape" mc:Ignorable="w14 w15 w16se w16cid w16 w16cex w16sdtdh wp14">
   <w:p>
     <w:pPr>
-      <w:pStyle w:val="Header"/>
+      <w:pStyle w:val="a6"/>
     </w:pPr>
   </w:p>
 </w:hdr>
 </file>
 
 <file path=word/header2.xml><?xml version="1.0" encoding="utf-8"?>
-<w:hdr xmlns:m="http://schemas.openxmlformats.org/officeDocument/2006/math" xmlns:mc="http://schemas.openxmlformats.org/markup-compatibility/2006" xmlns:mo="http://schemas.microsoft.com/office/mac/office/2008/main" xmlns:mv="urn:schemas-microsoft-com:mac:vml" xmlns:o="urn:schemas-microsoft-com:office:office" xmlns:r="http://schemas.openxmlformats.org/officeDocument/2006/relationships" xmlns:v="urn:schemas-microsoft-com:vml" xmlns:w10="urn:schemas-microsoft-com:office:word" xmlns:w14="http://schemas.microsoft.com/office/word/2010/wordml" xmlns:w="http://schemas.openxmlformats.org/wordprocessingml/2006/main" xmlns:wne="http://schemas.microsoft.com/office/word/2006/wordml" xmlns:wp14="http://schemas.microsoft.com/office/word/2010/wordprocessingDrawing" xmlns:wp="http://schemas.openxmlformats.org/drawingml/2006/wordprocessingDrawing" xmlns:wpc="http://schemas.microsoft.com/office/word/2010/wordprocessingCanvas" xmlns:wpg="http://schemas.microsoft.com/office/word/2010/wordprocessingGroup" xmlns:wpi="http://schemas.microsoft.com/office/word/2010/wordprocessingInk" xmlns:wps="http://schemas.microsoft.com/office/word/2010/wordprocessingShape" mc:Ignorable="w14 wp14">
+<w:hdr xmlns:wpc="http://schemas.microsoft.com/office/word/2010/wordprocessingCanvas" xmlns:cx="http://schemas.microsoft.com/office/drawing/2014/chartex" xmlns:cx1="http://schemas.microsoft.com/office/drawing/2015/9/8/chartex" xmlns:cx2="http://schemas.microsoft.com/office/drawing/2015/10/21/chartex" xmlns:cx3="http://schemas.microsoft.com/office/drawing/2016/5/9/chartex" xmlns:cx4="http://schemas.microsoft.com/office/drawing/2016/5/10/chartex" xmlns:cx5="http://schemas.microsoft.com/office/drawing/2016/5/11/chartex" xmlns:cx6="http://schemas.microsoft.com/office/drawing/2016/5/12/chartex" xmlns:cx7="http://schemas.microsoft.com/office/drawing/2016/5/13/chartex" xmlns:cx8="http://schemas.microsoft.com/office/drawing/2016/5/14/chartex" xmlns:mc="http://schemas.openxmlformats.org/markup-compatibility/2006" xmlns:aink="http://schemas.microsoft.com/office/drawing/2016/ink" xmlns:am3d="http://schemas.microsoft.com/office/drawing/2017/model3d" xmlns:o="urn:schemas-microsoft-com:office:office" xmlns:r="http://schemas.openxmlformats.org/officeDocument/2006/relationships" xmlns:m="http://schemas.openxmlformats.org/officeDocument/2006/math" xmlns:v="urn:schemas-microsoft-com:vml" xmlns:wp14="http://schemas.microsoft.com/office/word/2010/wordprocessingDrawing" xmlns:wp="http://schemas.openxmlformats.org/drawingml/2006/wordprocessingDrawing" xmlns:w10="urn:schemas-microsoft-com:office:word" xmlns:w="http://schemas.openxmlformats.org/wordprocessingml/2006/main" xmlns:w14="http://schemas.microsoft.com/office/word/2010/wordml" xmlns:w15="http://schemas.microsoft.com/office/word/2012/wordml" xmlns:w16cex="http://schemas.microsoft.com/office/word/2018/wordml/cex" xmlns:w16cid="http://schemas.microsoft.com/office/word/2016/wordml/cid" xmlns:w16="http://schemas.microsoft.com/office/word/2018/wordml" xmlns:w16sdtdh="http://schemas.microsoft.com/office/word/2020/wordml/sdtdatahash" xmlns:w16se="http://schemas.microsoft.com/office/word/2015/wordml/symex" xmlns:wpg="http://schemas.microsoft.com/office/word/2010/wordprocessingGroup" xmlns:wpi="http://schemas.microsoft.com/office/word/2010/wordprocessingInk" xmlns:wne="http://schemas.microsoft.com/office/word/2006/wordml" xmlns:wps="http://schemas.microsoft.com/office/word/2010/wordprocessingShape" mc:Ignorable="w14 w15 w16se w16cid w16 w16cex w16sdtdh wp14">
   <w:p>
     <w:pPr>
-      <w:pStyle w:val="Header"/>
+      <w:pStyle w:val="a6"/>
     </w:pPr>
   </w:p>
 </w:hdr>
 </file>
 
 <file path=word/header3.xml><?xml version="1.0" encoding="utf-8"?>
-<w:hdr xmlns:m="http://schemas.openxmlformats.org/officeDocument/2006/math" xmlns:mc="http://schemas.openxmlformats.org/markup-compatibility/2006" xmlns:mo="http://schemas.microsoft.com/office/mac/office/2008/main" xmlns:mv="urn:schemas-microsoft-com:mac:vml" xmlns:o="urn:schemas-microsoft-com:office:office" xmlns:r="http://schemas.openxmlformats.org/officeDocument/2006/relationships" xmlns:v="urn:schemas-microsoft-com:vml" xmlns:w10="urn:schemas-microsoft-com:office:word" xmlns:w14="http://schemas.microsoft.com/office/word/2010/wordml" xmlns:w="http://schemas.openxmlformats.org/wordprocessingml/2006/main" xmlns:wne="http://schemas.microsoft.com/office/word/2006/wordml" xmlns:wp14="http://schemas.microsoft.com/office/word/2010/wordprocessingDrawing" xmlns:wp="http://schemas.openxmlformats.org/drawingml/2006/wordprocessingDrawing" xmlns:wpc="http://schemas.microsoft.com/office/word/2010/wordprocessingCanvas" xmlns:wpg="http://schemas.microsoft.com/office/word/2010/wordprocessingGroup" xmlns:wpi="http://schemas.microsoft.com/office/word/2010/wordprocessingInk" xmlns:wps="http://schemas.microsoft.com/office/word/2010/wordprocessingShape" mc:Ignorable="w14 wp14">
+<w:hdr xmlns:wpc="http://schemas.microsoft.com/office/word/2010/wordprocessingCanvas" xmlns:cx="http://schemas.microsoft.com/office/drawing/2014/chartex" xmlns:cx1="http://schemas.microsoft.com/office/drawing/2015/9/8/chartex" xmlns:cx2="http://schemas.microsoft.com/office/drawing/2015/10/21/chartex" xmlns:cx3="http://schemas.microsoft.com/office/drawing/2016/5/9/chartex" xmlns:cx4="http://schemas.microsoft.com/office/drawing/2016/5/10/chartex" xmlns:cx5="http://schemas.microsoft.com/office/drawing/2016/5/11/chartex" xmlns:cx6="http://schemas.microsoft.com/office/drawing/2016/5/12/chartex" xmlns:cx7="http://schemas.microsoft.com/office/drawing/2016/5/13/chartex" xmlns:cx8="http://schemas.microsoft.com/office/drawing/2016/5/14/chartex" xmlns:mc="http://schemas.openxmlformats.org/markup-compatibility/2006" xmlns:aink="http://schemas.microsoft.com/office/drawing/2016/ink" xmlns:am3d="http://schemas.microsoft.com/office/drawing/2017/model3d" xmlns:o="urn:schemas-microsoft-com:office:office" xmlns:r="http://schemas.openxmlformats.org/officeDocument/2006/relationships" xmlns:m="http://schemas.openxmlformats.org/officeDocument/2006/math" xmlns:v="urn:schemas-microsoft-com:vml" xmlns:wp14="http://schemas.microsoft.com/office/word/2010/wordprocessingDrawing" xmlns:wp="http://schemas.openxmlformats.org/drawingml/2006/wordprocessingDrawing" xmlns:w10="urn:schemas-microsoft-com:office:word" xmlns:w="http://schemas.openxmlformats.org/wordprocessingml/2006/main" xmlns:w14="http://schemas.microsoft.com/office/word/2010/wordml" xmlns:w15="http://schemas.microsoft.com/office/word/2012/wordml" xmlns:w16cex="http://schemas.microsoft.com/office/word/2018/wordml/cex" xmlns:w16cid="http://schemas.microsoft.com/office/word/2016/wordml/cid" xmlns:w16="http://schemas.microsoft.com/office/word/2018/wordml" xmlns:w16sdtdh="http://schemas.microsoft.com/office/word/2020/wordml/sdtdatahash" xmlns:w16se="http://schemas.microsoft.com/office/word/2015/wordml/symex" xmlns:wpg="http://schemas.microsoft.com/office/word/2010/wordprocessingGroup" xmlns:wpi="http://schemas.microsoft.com/office/word/2010/wordprocessingInk" xmlns:wne="http://schemas.microsoft.com/office/word/2006/wordml" xmlns:wps="http://schemas.microsoft.com/office/word/2010/wordprocessingShape" mc:Ignorable="w14 w15 w16se w16cid w16 w16cex w16sdtdh wp14">
   <w:p>
     <w:pPr>
-      <w:pStyle w:val="Header"/>
+      <w:pStyle w:val="a6"/>
     </w:pPr>
   </w:p>
 </w:hdr>
 </file>
 
 <file path=word/numbering.xml><?xml version="1.0" encoding="utf-8"?>
-<w:numbering xmlns:wpc="http://schemas.microsoft.com/office/word/2010/wordprocessingCanvas" xmlns:cx="http://schemas.microsoft.com/office/drawing/2014/chartex" xmlns:cx1="http://schemas.microsoft.com/office/drawing/2015/9/8/chartex" xmlns:cx2="http://schemas.microsoft.com/office/drawing/2015/10/21/chartex" xmlns:cx3="http://schemas.microsoft.com/office/drawing/2016/5/9/chartex" xmlns:cx4="http://schemas.microsoft.com/office/drawing/2016/5/10/chartex" xmlns:cx5="http://schemas.microsoft.com/office/drawing/2016/5/11/chartex" xmlns:cx6="http://schemas.microsoft.com/office/drawing/2016/5/12/chartex" xmlns:cx7="http://schemas.microsoft.com/office/drawing/2016/5/13/chartex" xmlns:cx8="http://schemas.microsoft.com/office/drawing/2016/5/14/chartex" xmlns:mc="http://schemas.openxmlformats.org/markup-compatibility/2006" xmlns:aink="http://schemas.microsoft.com/office/drawing/2016/ink" xmlns:am3d="http://schemas.microsoft.com/office/drawing/2017/model3d" xmlns:o="urn:schemas-microsoft-com:office:office" xmlns:oel="http://schemas.microsoft.com/office/2019/extlst" xmlns:r="http://schemas.openxmlformats.org/officeDocument/2006/relationships" xmlns:m="http://schemas.openxmlformats.org/officeDocument/2006/math" xmlns:v="urn:schemas-microsoft-com:vml" xmlns:wp14="http://schemas.microsoft.com/office/word/2010/wordprocessingDrawing" xmlns:wp="http://schemas.openxmlformats.org/drawingml/2006/wordprocessingDrawing" xmlns:w10="urn:schemas-microsoft-com:office:word" xmlns:w="http://schemas.openxmlformats.org/wordprocessingml/2006/main" xmlns:w14="http://schemas.microsoft.com/office/word/2010/wordml" xmlns:w15="http://schemas.microsoft.com/office/word/2012/wordml" xmlns:w16cex="http://schemas.microsoft.com/office/word/2018/wordml/cex" xmlns:w16cid="http://schemas.microsoft.com/office/word/2016/wordml/cid" xmlns:w16="http://schemas.microsoft.com/office/word/2018/wordml" xmlns:w16du="http://schemas.microsoft.com/office/word/2023/wordml/word16du" xmlns:w16sdtdh="http://schemas.microsoft.com/office/word/2020/wordml/sdtdatahash" xmlns:w16sdtfl="http://schemas.microsoft.com/office/word/2024/wordml/sdtformatlock" xmlns:w16se="http://schemas.microsoft.com/office/word/2015/wordml/symex" xmlns:wpg="http://schemas.microsoft.com/office/word/2010/wordprocessingGroup" xmlns:wpi="http://schemas.microsoft.com/office/word/2010/wordprocessingInk" xmlns:wne="http://schemas.microsoft.com/office/word/2006/wordml" xmlns:wps="http://schemas.microsoft.com/office/word/2010/wordprocessingShape" mc:Ignorable="w14 w15 w16se w16cid w16 w16cex w16sdtdh w16sdtfl w16du wp14">
+<w:numbering xmlns:wpc="http://schemas.microsoft.com/office/word/2010/wordprocessingCanvas" xmlns:cx="http://schemas.microsoft.com/office/drawing/2014/chartex" xmlns:cx1="http://schemas.microsoft.com/office/drawing/2015/9/8/chartex" xmlns:cx2="http://schemas.microsoft.com/office/drawing/2015/10/21/chartex" xmlns:cx3="http://schemas.microsoft.com/office/drawing/2016/5/9/chartex" xmlns:cx4="http://schemas.microsoft.com/office/drawing/2016/5/10/chartex" xmlns:cx5="http://schemas.microsoft.com/office/drawing/2016/5/11/chartex" xmlns:cx6="http://schemas.microsoft.com/office/drawing/2016/5/12/chartex" xmlns:cx7="http://schemas.microsoft.com/office/drawing/2016/5/13/chartex" xmlns:cx8="http://schemas.microsoft.com/office/drawing/2016/5/14/chartex" xmlns:mc="http://schemas.openxmlformats.org/markup-compatibility/2006" xmlns:aink="http://schemas.microsoft.com/office/drawing/2016/ink" xmlns:am3d="http://schemas.microsoft.com/office/drawing/2017/model3d" xmlns:o="urn:schemas-microsoft-com:office:office" xmlns:r="http://schemas.openxmlformats.org/officeDocument/2006/relationships" xmlns:m="http://schemas.openxmlformats.org/officeDocument/2006/math" xmlns:v="urn:schemas-microsoft-com:vml" xmlns:wp14="http://schemas.microsoft.com/office/word/2010/wordprocessingDrawing" xmlns:wp="http://schemas.openxmlformats.org/drawingml/2006/wordprocessingDrawing" xmlns:w10="urn:schemas-microsoft-com:office:word" xmlns:w="http://schemas.openxmlformats.org/wordprocessingml/2006/main" xmlns:w14="http://schemas.microsoft.com/office/word/2010/wordml" xmlns:w15="http://schemas.microsoft.com/office/word/2012/wordml" xmlns:w16cex="http://schemas.microsoft.com/office/word/2018/wordml/cex" xmlns:w16cid="http://schemas.microsoft.com/office/word/2016/wordml/cid" xmlns:w16="http://schemas.microsoft.com/office/word/2018/wordml" xmlns:w16sdtdh="http://schemas.microsoft.com/office/word/2020/wordml/sdtdatahash" xmlns:w16se="http://schemas.microsoft.com/office/word/2015/wordml/symex" xmlns:wpg="http://schemas.microsoft.com/office/word/2010/wordprocessingGroup" xmlns:wpi="http://schemas.microsoft.com/office/word/2010/wordprocessingInk" xmlns:wne="http://schemas.microsoft.com/office/word/2006/wordml" xmlns:wps="http://schemas.microsoft.com/office/word/2010/wordprocessingShape" mc:Ignorable="w14 w15 w16se w16cid w16 w16cex w16sdtdh wp14">
   <w:abstractNum w:abstractNumId="0" w15:restartNumberingAfterBreak="0">
     <w:nsid w:val="049575D0"/>
     <w:multiLevelType w:val="hybridMultilevel"/>
@@ -7123,104 +8194,104 @@
       </w:pPr>
     </w:lvl>
   </w:abstractNum>
-  <w:num w:numId="1" w16cid:durableId="31731517">
+  <w:num w:numId="1">
     <w:abstractNumId w:val="3"/>
   </w:num>
-  <w:num w:numId="2" w16cid:durableId="1245801036">
+  <w:num w:numId="2">
     <w:abstractNumId w:val="10"/>
   </w:num>
-  <w:num w:numId="3" w16cid:durableId="978875365">
+  <w:num w:numId="3">
     <w:abstractNumId w:val="11"/>
   </w:num>
-  <w:num w:numId="4" w16cid:durableId="1113477302">
+  <w:num w:numId="4">
     <w:abstractNumId w:val="15"/>
   </w:num>
-  <w:num w:numId="5" w16cid:durableId="1605964914">
+  <w:num w:numId="5">
     <w:abstractNumId w:val="0"/>
   </w:num>
-  <w:num w:numId="6" w16cid:durableId="904609107">
+  <w:num w:numId="6">
     <w:abstractNumId w:val="13"/>
   </w:num>
-  <w:num w:numId="7" w16cid:durableId="1458065962">
+  <w:num w:numId="7">
     <w:abstractNumId w:val="18"/>
   </w:num>
-  <w:num w:numId="8" w16cid:durableId="1680350478">
+  <w:num w:numId="8">
     <w:abstractNumId w:val="24"/>
   </w:num>
-  <w:num w:numId="9" w16cid:durableId="2046327165">
+  <w:num w:numId="9">
     <w:abstractNumId w:val="12"/>
   </w:num>
-  <w:num w:numId="10" w16cid:durableId="763258350">
+  <w:num w:numId="10">
     <w:abstractNumId w:val="30"/>
   </w:num>
-  <w:num w:numId="11" w16cid:durableId="2006592703">
+  <w:num w:numId="11">
     <w:abstractNumId w:val="27"/>
   </w:num>
-  <w:num w:numId="12" w16cid:durableId="1176506380">
+  <w:num w:numId="12">
     <w:abstractNumId w:val="17"/>
   </w:num>
-  <w:num w:numId="13" w16cid:durableId="215901606">
+  <w:num w:numId="13">
     <w:abstractNumId w:val="26"/>
   </w:num>
-  <w:num w:numId="14" w16cid:durableId="918514437">
+  <w:num w:numId="14">
     <w:abstractNumId w:val="1"/>
   </w:num>
-  <w:num w:numId="15" w16cid:durableId="1827939027">
+  <w:num w:numId="15">
     <w:abstractNumId w:val="22"/>
   </w:num>
-  <w:num w:numId="16" w16cid:durableId="190270277">
+  <w:num w:numId="16">
     <w:abstractNumId w:val="9"/>
   </w:num>
-  <w:num w:numId="17" w16cid:durableId="525480897">
+  <w:num w:numId="17">
     <w:abstractNumId w:val="20"/>
   </w:num>
-  <w:num w:numId="18" w16cid:durableId="1322736826">
+  <w:num w:numId="18">
     <w:abstractNumId w:val="8"/>
   </w:num>
-  <w:num w:numId="19" w16cid:durableId="756364431">
+  <w:num w:numId="19">
     <w:abstractNumId w:val="7"/>
   </w:num>
-  <w:num w:numId="20" w16cid:durableId="1127818585">
+  <w:num w:numId="20">
     <w:abstractNumId w:val="4"/>
   </w:num>
-  <w:num w:numId="21" w16cid:durableId="2136175816">
+  <w:num w:numId="21">
     <w:abstractNumId w:val="28"/>
   </w:num>
-  <w:num w:numId="22" w16cid:durableId="1517617942">
+  <w:num w:numId="22">
     <w:abstractNumId w:val="29"/>
   </w:num>
-  <w:num w:numId="23" w16cid:durableId="2041586658">
+  <w:num w:numId="23">
     <w:abstractNumId w:val="6"/>
   </w:num>
-  <w:num w:numId="24" w16cid:durableId="410280276">
+  <w:num w:numId="24">
     <w:abstractNumId w:val="19"/>
   </w:num>
-  <w:num w:numId="25" w16cid:durableId="1347092703">
+  <w:num w:numId="25">
     <w:abstractNumId w:val="14"/>
   </w:num>
-  <w:num w:numId="26" w16cid:durableId="361634690">
+  <w:num w:numId="26">
     <w:abstractNumId w:val="2"/>
   </w:num>
-  <w:num w:numId="27" w16cid:durableId="80033771">
+  <w:num w:numId="27">
     <w:abstractNumId w:val="25"/>
   </w:num>
-  <w:num w:numId="28" w16cid:durableId="416026118">
+  <w:num w:numId="28">
     <w:abstractNumId w:val="23"/>
   </w:num>
-  <w:num w:numId="29" w16cid:durableId="1507749562">
+  <w:num w:numId="29">
     <w:abstractNumId w:val="16"/>
   </w:num>
-  <w:num w:numId="30" w16cid:durableId="1772428814">
+  <w:num w:numId="30">
     <w:abstractNumId w:val="21"/>
   </w:num>
-  <w:num w:numId="31" w16cid:durableId="513810541">
+  <w:num w:numId="31">
     <w:abstractNumId w:val="5"/>
   </w:num>
 </w:numbering>
 </file>
 
 <file path=word/styles.xml><?xml version="1.0" encoding="utf-8"?>
-<w:styles xmlns:mc="http://schemas.openxmlformats.org/markup-compatibility/2006" xmlns:r="http://schemas.openxmlformats.org/officeDocument/2006/relationships" xmlns:w="http://schemas.openxmlformats.org/wordprocessingml/2006/main" xmlns:w14="http://schemas.microsoft.com/office/word/2010/wordml" xmlns:w15="http://schemas.microsoft.com/office/word/2012/wordml" xmlns:w16cex="http://schemas.microsoft.com/office/word/2018/wordml/cex" xmlns:w16cid="http://schemas.microsoft.com/office/word/2016/wordml/cid" xmlns:w16="http://schemas.microsoft.com/office/word/2018/wordml" xmlns:w16du="http://schemas.microsoft.com/office/word/2023/wordml/word16du" xmlns:w16sdtdh="http://schemas.microsoft.com/office/word/2020/wordml/sdtdatahash" xmlns:w16sdtfl="http://schemas.microsoft.com/office/word/2024/wordml/sdtformatlock" xmlns:w16se="http://schemas.microsoft.com/office/word/2015/wordml/symex" mc:Ignorable="w14 w15 w16se w16cid w16 w16cex w16sdtdh w16sdtfl w16du">
+<w:styles xmlns:mc="http://schemas.openxmlformats.org/markup-compatibility/2006" xmlns:r="http://schemas.openxmlformats.org/officeDocument/2006/relationships" xmlns:w="http://schemas.openxmlformats.org/wordprocessingml/2006/main" xmlns:w14="http://schemas.microsoft.com/office/word/2010/wordml" xmlns:w15="http://schemas.microsoft.com/office/word/2012/wordml" xmlns:w16cex="http://schemas.microsoft.com/office/word/2018/wordml/cex" xmlns:w16cid="http://schemas.microsoft.com/office/word/2016/wordml/cid" xmlns:w16="http://schemas.microsoft.com/office/word/2018/wordml" xmlns:w16sdtdh="http://schemas.microsoft.com/office/word/2020/wordml/sdtdatahash" xmlns:w16se="http://schemas.microsoft.com/office/word/2015/wordml/symex" mc:Ignorable="w14 w15 w16se w16cid w16 w16cex w16sdtdh">
   <w:docDefaults>
     <w:rPrDefault>
       <w:rPr>
@@ -7616,7 +8687,7 @@
     <w:lsdException w:name="Unresolved Mention" w:semiHidden="1" w:unhideWhenUsed="1"/>
     <w:lsdException w:name="Smart Link" w:semiHidden="1" w:unhideWhenUsed="1"/>
   </w:latentStyles>
-  <w:style w:type="paragraph" w:default="1" w:styleId="Normal">
+  <w:style w:type="paragraph" w:default="1" w:styleId="a">
     <w:name w:val="Normal"/>
     <w:qFormat/>
     <w:rsid w:val="00401560"/>
@@ -7626,11 +8697,11 @@
       <w:lang w:val="ru-RU"/>
     </w:rPr>
   </w:style>
-  <w:style w:type="paragraph" w:styleId="Heading1">
+  <w:style w:type="paragraph" w:styleId="1">
     <w:name w:val="heading 1"/>
-    <w:basedOn w:val="Normal"/>
-    <w:next w:val="Normal"/>
-    <w:link w:val="Heading1Char"/>
+    <w:basedOn w:val="a"/>
+    <w:next w:val="a"/>
+    <w:link w:val="10"/>
     <w:uiPriority w:val="9"/>
     <w:qFormat/>
     <w:rsid w:val="00D85A2F"/>
@@ -7647,11 +8718,11 @@
       <w:szCs w:val="36"/>
     </w:rPr>
   </w:style>
-  <w:style w:type="paragraph" w:styleId="Heading2">
+  <w:style w:type="paragraph" w:styleId="2">
     <w:name w:val="heading 2"/>
-    <w:basedOn w:val="Normal"/>
-    <w:next w:val="Normal"/>
-    <w:link w:val="Heading2Char"/>
+    <w:basedOn w:val="a"/>
+    <w:next w:val="a"/>
+    <w:link w:val="20"/>
     <w:uiPriority w:val="9"/>
     <w:unhideWhenUsed/>
     <w:qFormat/>
@@ -7669,10 +8740,10 @@
       <w:szCs w:val="32"/>
     </w:rPr>
   </w:style>
-  <w:style w:type="paragraph" w:styleId="Heading3">
+  <w:style w:type="paragraph" w:styleId="3">
     <w:name w:val="heading 3"/>
-    <w:basedOn w:val="Normal"/>
-    <w:next w:val="Normal"/>
+    <w:basedOn w:val="a"/>
+    <w:next w:val="a"/>
     <w:uiPriority w:val="9"/>
     <w:semiHidden/>
     <w:unhideWhenUsed/>
@@ -7687,10 +8758,10 @@
       <w:color w:val="0F4761"/>
     </w:rPr>
   </w:style>
-  <w:style w:type="paragraph" w:styleId="Heading4">
+  <w:style w:type="paragraph" w:styleId="4">
     <w:name w:val="heading 4"/>
-    <w:basedOn w:val="Normal"/>
-    <w:next w:val="Normal"/>
+    <w:basedOn w:val="a"/>
+    <w:next w:val="a"/>
     <w:uiPriority w:val="9"/>
     <w:semiHidden/>
     <w:unhideWhenUsed/>
@@ -7707,10 +8778,10 @@
       <w:color w:val="0F4761"/>
     </w:rPr>
   </w:style>
-  <w:style w:type="paragraph" w:styleId="Heading5">
+  <w:style w:type="paragraph" w:styleId="5">
     <w:name w:val="heading 5"/>
-    <w:basedOn w:val="Normal"/>
-    <w:next w:val="Normal"/>
+    <w:basedOn w:val="a"/>
+    <w:next w:val="a"/>
     <w:uiPriority w:val="9"/>
     <w:semiHidden/>
     <w:unhideWhenUsed/>
@@ -7725,10 +8796,10 @@
       <w:color w:val="0F4761"/>
     </w:rPr>
   </w:style>
-  <w:style w:type="paragraph" w:styleId="Heading6">
+  <w:style w:type="paragraph" w:styleId="6">
     <w:name w:val="heading 6"/>
-    <w:basedOn w:val="Normal"/>
-    <w:next w:val="Normal"/>
+    <w:basedOn w:val="a"/>
+    <w:next w:val="a"/>
     <w:uiPriority w:val="9"/>
     <w:semiHidden/>
     <w:unhideWhenUsed/>
@@ -7745,13 +8816,13 @@
       <w:color w:val="595959"/>
     </w:rPr>
   </w:style>
-  <w:style w:type="character" w:default="1" w:styleId="DefaultParagraphFont">
+  <w:style w:type="character" w:default="1" w:styleId="a0">
     <w:name w:val="Default Paragraph Font"/>
     <w:uiPriority w:val="1"/>
     <w:semiHidden/>
     <w:unhideWhenUsed/>
   </w:style>
-  <w:style w:type="table" w:default="1" w:styleId="TableNormal">
+  <w:style w:type="table" w:default="1" w:styleId="a1">
     <w:name w:val="Normal Table"/>
     <w:uiPriority w:val="99"/>
     <w:semiHidden/>
@@ -7766,13 +8837,13 @@
       </w:tblCellMar>
     </w:tblPr>
   </w:style>
-  <w:style w:type="numbering" w:default="1" w:styleId="NoList">
+  <w:style w:type="numbering" w:default="1" w:styleId="a2">
     <w:name w:val="No List"/>
     <w:uiPriority w:val="99"/>
     <w:semiHidden/>
     <w:unhideWhenUsed/>
   </w:style>
-  <w:style w:type="table" w:customStyle="1" w:styleId="TableNormal0">
+  <w:style w:type="table" w:customStyle="1" w:styleId="TableNormal">
     <w:name w:val="TableNormal"/>
     <w:tblPr>
       <w:tblCellMar>
@@ -7783,10 +8854,10 @@
       </w:tblCellMar>
     </w:tblPr>
   </w:style>
-  <w:style w:type="paragraph" w:styleId="Title">
+  <w:style w:type="paragraph" w:styleId="a3">
     <w:name w:val="Title"/>
-    <w:basedOn w:val="Normal"/>
-    <w:next w:val="Normal"/>
+    <w:basedOn w:val="a"/>
+    <w:next w:val="a"/>
     <w:uiPriority w:val="10"/>
     <w:qFormat/>
     <w:pPr>
@@ -7798,10 +8869,10 @@
       <w:szCs w:val="56"/>
     </w:rPr>
   </w:style>
-  <w:style w:type="paragraph" w:styleId="Subtitle">
+  <w:style w:type="paragraph" w:styleId="a4">
     <w:name w:val="Subtitle"/>
-    <w:basedOn w:val="Normal"/>
-    <w:next w:val="Normal"/>
+    <w:basedOn w:val="a"/>
+    <w:next w:val="a"/>
     <w:uiPriority w:val="11"/>
     <w:qFormat/>
     <w:pPr>
@@ -7816,18 +8887,18 @@
       <w:szCs w:val="30"/>
     </w:rPr>
   </w:style>
-  <w:style w:type="paragraph" w:styleId="NormalWeb">
+  <w:style w:type="paragraph" w:styleId="a5">
     <w:name w:val="Normal (Web)"/>
-    <w:basedOn w:val="Normal"/>
+    <w:basedOn w:val="a"/>
     <w:uiPriority w:val="99"/>
     <w:semiHidden/>
     <w:unhideWhenUsed/>
     <w:rsid w:val="00412D25"/>
   </w:style>
-  <w:style w:type="character" w:customStyle="1" w:styleId="Heading2Char">
-    <w:name w:val="Heading 2 Char"/>
-    <w:basedOn w:val="DefaultParagraphFont"/>
-    <w:link w:val="Heading2"/>
+  <w:style w:type="character" w:customStyle="1" w:styleId="20">
+    <w:name w:val="Заголовок 2 Знак"/>
+    <w:basedOn w:val="a0"/>
+    <w:link w:val="2"/>
     <w:uiPriority w:val="9"/>
     <w:rsid w:val="00AE5117"/>
     <w:rPr>
@@ -7838,10 +8909,10 @@
       <w:lang w:val="ru-RU"/>
     </w:rPr>
   </w:style>
-  <w:style w:type="character" w:customStyle="1" w:styleId="Heading1Char">
-    <w:name w:val="Heading 1 Char"/>
-    <w:basedOn w:val="DefaultParagraphFont"/>
-    <w:link w:val="Heading1"/>
+  <w:style w:type="character" w:customStyle="1" w:styleId="10">
+    <w:name w:val="Заголовок 1 Знак"/>
+    <w:basedOn w:val="a0"/>
+    <w:link w:val="1"/>
     <w:uiPriority w:val="9"/>
     <w:rsid w:val="00A11BB1"/>
     <w:rPr>
@@ -7852,10 +8923,10 @@
       <w:lang w:val="ru-RU"/>
     </w:rPr>
   </w:style>
-  <w:style w:type="paragraph" w:styleId="Header">
+  <w:style w:type="paragraph" w:styleId="a6">
     <w:name w:val="header"/>
-    <w:basedOn w:val="Normal"/>
-    <w:link w:val="HeaderChar"/>
+    <w:basedOn w:val="a"/>
+    <w:link w:val="a7"/>
     <w:uiPriority w:val="99"/>
     <w:unhideWhenUsed/>
     <w:rsid w:val="00A21E3E"/>
@@ -7867,10 +8938,10 @@
       <w:spacing w:line="240" w:lineRule="auto"/>
     </w:pPr>
   </w:style>
-  <w:style w:type="character" w:customStyle="1" w:styleId="HeaderChar">
-    <w:name w:val="Header Char"/>
-    <w:basedOn w:val="DefaultParagraphFont"/>
-    <w:link w:val="Header"/>
+  <w:style w:type="character" w:customStyle="1" w:styleId="a7">
+    <w:name w:val="Верхний колонтитул Знак"/>
+    <w:basedOn w:val="a0"/>
+    <w:link w:val="a6"/>
     <w:uiPriority w:val="99"/>
     <w:rsid w:val="00A21E3E"/>
     <w:rPr>
@@ -7879,10 +8950,10 @@
       <w:lang w:val="ru-RU"/>
     </w:rPr>
   </w:style>
-  <w:style w:type="paragraph" w:styleId="Footer">
+  <w:style w:type="paragraph" w:styleId="a8">
     <w:name w:val="footer"/>
-    <w:basedOn w:val="Normal"/>
-    <w:link w:val="FooterChar"/>
+    <w:basedOn w:val="a"/>
+    <w:link w:val="a9"/>
     <w:uiPriority w:val="99"/>
     <w:unhideWhenUsed/>
     <w:rsid w:val="00A21E3E"/>
@@ -7894,10 +8965,10 @@
       <w:spacing w:line="240" w:lineRule="auto"/>
     </w:pPr>
   </w:style>
-  <w:style w:type="character" w:customStyle="1" w:styleId="FooterChar">
-    <w:name w:val="Footer Char"/>
-    <w:basedOn w:val="DefaultParagraphFont"/>
-    <w:link w:val="Footer"/>
+  <w:style w:type="character" w:customStyle="1" w:styleId="a9">
+    <w:name w:val="Нижний колонтитул Знак"/>
+    <w:basedOn w:val="a0"/>
+    <w:link w:val="a8"/>
     <w:uiPriority w:val="99"/>
     <w:rsid w:val="00A21E3E"/>
     <w:rPr>
@@ -7906,9 +8977,9 @@
       <w:lang w:val="ru-RU"/>
     </w:rPr>
   </w:style>
-  <w:style w:type="paragraph" w:styleId="ListParagraph">
+  <w:style w:type="paragraph" w:styleId="aa">
     <w:name w:val="List Paragraph"/>
-    <w:basedOn w:val="Normal"/>
+    <w:basedOn w:val="a"/>
     <w:uiPriority w:val="34"/>
     <w:qFormat/>
     <w:rsid w:val="0051190B"/>
@@ -7919,7 +8990,7 @@
   </w:style>
   <w:style w:type="paragraph" w:customStyle="1" w:styleId="p1">
     <w:name w:val="p1"/>
-    <w:basedOn w:val="Normal"/>
+    <w:basedOn w:val="a"/>
     <w:rsid w:val="00CE66B5"/>
     <w:pPr>
       <w:spacing w:line="240" w:lineRule="auto"/>
@@ -7935,7 +9006,7 @@
   </w:style>
   <w:style w:type="character" w:customStyle="1" w:styleId="s1">
     <w:name w:val="s1"/>
-    <w:basedOn w:val="DefaultParagraphFont"/>
+    <w:basedOn w:val="a0"/>
     <w:rsid w:val="00CE66B5"/>
     <w:rPr>
       <w:rFonts w:ascii=".SFUI-Regular" w:hAnsi=".SFUI-Regular" w:hint="default"/>
@@ -7947,9 +9018,9 @@
       <w:szCs w:val="18"/>
     </w:rPr>
   </w:style>
-  <w:style w:type="table" w:styleId="TableGrid">
+  <w:style w:type="table" w:styleId="ab">
     <w:name w:val="Table Grid"/>
-    <w:basedOn w:val="TableNormal"/>
+    <w:basedOn w:val="a1"/>
     <w:uiPriority w:val="59"/>
     <w:rsid w:val="00820F07"/>
     <w:pPr>
@@ -8305,7 +9376,6 @@
 <ds:datastoreItem xmlns:ds="http://schemas.openxmlformats.org/officeDocument/2006/customXml" ds:itemID="{37E19018-E1CC-4A93-A57F-453144F77F1B}">
   <ds:schemaRefs>
     <ds:schemaRef ds:uri="http://schemas.openxmlformats.org/officeDocument/2006/bibliography"/>
-    <ds:schemaRef ds:uri="http://www.w3.org/2000/xmlns/"/>
   </ds:schemaRefs>
 </ds:datastoreItem>
 </file>
</xml_diff>